<commit_message>
Resubmit - Text & Fig. 6
</commit_message>
<xml_diff>
--- a/supplementary4.docx
+++ b/supplementary4.docx
@@ -249,7 +249,7 @@
           <v:shape id="_x0000_i1025" type="#_x0000_t75" style="width:297pt;height:361pt" o:ole="">
             <v:imagedata r:id="rId5" o:title="" croptop="5243f" cropbottom="4588f" cropleft="3277f" cropright="4916f"/>
           </v:shape>
-          <o:OLEObject Type="Embed" ProgID="Origin50.Graph" ShapeID="_x0000_i1025" DrawAspect="Content" ObjectID="_1838819434" r:id="rId6"/>
+          <o:OLEObject Type="Embed" ProgID="Origin50.Graph" ShapeID="_x0000_i1025" DrawAspect="Content" ObjectID="_1839596706" r:id="rId6"/>
         </w:object>
       </w:r>
     </w:p>
@@ -332,7 +332,7 @@
           <v:shape id="_x0000_i1026" type="#_x0000_t75" style="width:348pt;height:422.5pt;mso-position-vertical:absolute" o:ole="">
             <v:imagedata r:id="rId7" o:title="" croptop="5242f" cropbottom="4587f" cropleft="3277f" cropright="4916f"/>
           </v:shape>
-          <o:OLEObject Type="Embed" ProgID="Origin50.Graph" ShapeID="_x0000_i1026" DrawAspect="Content" ObjectID="_1838819435" r:id="rId8"/>
+          <o:OLEObject Type="Embed" ProgID="Origin50.Graph" ShapeID="_x0000_i1026" DrawAspect="Content" ObjectID="_1839596707" r:id="rId8"/>
         </w:object>
       </w:r>
     </w:p>
@@ -9718,7 +9718,7 @@
                 <w:rFonts w:cstheme="minorHAnsi"/>
                 <w:sz w:val="16"/>
                 <w:szCs w:val="16"/>
-                <w:highlight w:val="yellow"/>
+                <w:highlight w:val="green"/>
               </w:rPr>
               <w:t>0.0</w:t>
             </w:r>
@@ -9744,7 +9744,7 @@
                 <w:sz w:val="16"/>
                 <w:szCs w:val="16"/>
               </w:rPr>
-              <w:t>1.767</w:t>
+              <w:t>1.801</w:t>
             </w:r>
           </w:p>
         </w:tc>
@@ -9768,7 +9768,7 @@
                 <w:sz w:val="16"/>
                 <w:szCs w:val="16"/>
               </w:rPr>
-              <w:t>1.767</w:t>
+              <w:t>1.801</w:t>
             </w:r>
           </w:p>
         </w:tc>
@@ -9792,7 +9792,7 @@
                 <w:sz w:val="16"/>
                 <w:szCs w:val="16"/>
               </w:rPr>
-              <w:t>1.845</w:t>
+              <w:t>1.876</w:t>
             </w:r>
           </w:p>
         </w:tc>
@@ -9816,7 +9816,7 @@
                 <w:sz w:val="16"/>
                 <w:szCs w:val="16"/>
               </w:rPr>
-              <w:t>1.845</w:t>
+              <w:t>1.876</w:t>
             </w:r>
           </w:p>
         </w:tc>
@@ -9862,9 +9862,16 @@
       </w:r>
       <w:r>
         <w:rPr>
-          <w:highlight w:val="yellow"/>
-        </w:rPr>
-        <w:t>1.809</w:t>
+          <w:highlight w:val="green"/>
+        </w:rPr>
+        <w:t>1.8</w:t>
+      </w:r>
+      <w:r>
+        <w:rPr>
+          <w:highlight w:val="green"/>
+          <w:lang w:val="ru-RU"/>
+        </w:rPr>
+        <w:t>42</w:t>
       </w:r>
       <w:r>
         <w:t xml:space="preserve"> eV (</w:t>
@@ -9913,12 +9920,7 @@
         <w:t>vs.</w:t>
       </w:r>
       <w:r>
-        <w:t xml:space="preserve"> parall</w:t>
-      </w:r>
-      <w:bookmarkStart w:id="0" w:name="_GoBack"/>
-      <w:bookmarkEnd w:id="0"/>
-      <w:r>
-        <w:t>el shifts (</w:t>
+        <w:t xml:space="preserve"> parallel shifts (</w:t>
       </w:r>
       <w:r>
         <w:rPr>
@@ -18418,9 +18420,16 @@
       </w:r>
       <w:r>
         <w:rPr>
-          <w:highlight w:val="yellow"/>
-        </w:rPr>
-        <w:t>1.809</w:t>
+          <w:highlight w:val="green"/>
+        </w:rPr>
+        <w:t>1.8</w:t>
+      </w:r>
+      <w:r>
+        <w:rPr>
+          <w:highlight w:val="green"/>
+          <w:lang w:val="ru-RU"/>
+        </w:rPr>
+        <w:t>42</w:t>
       </w:r>
       <w:r>
         <w:t xml:space="preserve"> eV (</w:t>
@@ -18451,7 +18460,19 @@
         <w:t xml:space="preserve">Table S3. </w:t>
       </w:r>
       <w:r>
-        <w:t>Main c</w:t>
+        <w:rPr>
+          <w:highlight w:val="green"/>
+        </w:rPr>
+        <w:t>Ma</w:t>
+      </w:r>
+      <w:r>
+        <w:rPr>
+          <w:highlight w:val="green"/>
+        </w:rPr>
+        <w:t>jor</w:t>
+      </w:r>
+      <w:r>
+        <w:t xml:space="preserve"> c</w:t>
       </w:r>
       <w:r>
         <w:t>ontributions</w:t>
@@ -18473,6 +18494,12 @@
       </w:r>
       <w:r>
         <w:t xml:space="preserve"> Q-band transitions of face-to-face ZnPc dimers</w:t>
+      </w:r>
+      <w:r>
+        <w:rPr>
+          <w:highlight w:val="green"/>
+        </w:rPr>
+        <w:t>. Allowed transitions are shown in bold</w:t>
       </w:r>
     </w:p>
     <w:tbl>
@@ -18938,6 +18965,7 @@
                 <w:rFonts w:cstheme="minorHAnsi"/>
                 <w:sz w:val="16"/>
                 <w:szCs w:val="16"/>
+                <w:highlight w:val="green"/>
               </w:rPr>
               <w:t>3.5</w:t>
             </w:r>
@@ -18950,7 +18978,7 @@
             <w:tcBorders>
               <w:bottom w:val="nil"/>
             </w:tcBorders>
-            <w:shd w:val="clear" w:color="auto" w:fill="E7E6E6" w:themeFill="background2"/>
+            <w:shd w:val="clear" w:color="auto" w:fill="auto"/>
           </w:tcPr>
           <w:p>
             <w:pPr>
@@ -18990,23 +19018,23 @@
             <w:tcBorders>
               <w:bottom w:val="nil"/>
             </w:tcBorders>
-            <w:shd w:val="clear" w:color="auto" w:fill="E7E6E6" w:themeFill="background2"/>
-          </w:tcPr>
-          <w:p>
-            <w:pPr>
-              <w:jc w:val="right"/>
-              <w:rPr>
-                <w:sz w:val="16"/>
-                <w:szCs w:val="16"/>
-              </w:rPr>
-            </w:pPr>
-            <w:r>
-              <w:rPr>
-                <w:rFonts w:cstheme="minorHAnsi"/>
-                <w:sz w:val="16"/>
-                <w:szCs w:val="16"/>
-              </w:rPr>
-              <w:t>1.147</w:t>
+            <w:shd w:val="clear" w:color="auto" w:fill="auto"/>
+          </w:tcPr>
+          <w:p>
+            <w:pPr>
+              <w:jc w:val="right"/>
+              <w:rPr>
+                <w:sz w:val="16"/>
+                <w:szCs w:val="16"/>
+              </w:rPr>
+            </w:pPr>
+            <w:r>
+              <w:rPr>
+                <w:rFonts w:cstheme="minorHAnsi"/>
+                <w:sz w:val="16"/>
+                <w:szCs w:val="16"/>
+              </w:rPr>
+              <w:t>1.177</w:t>
             </w:r>
           </w:p>
         </w:tc>
@@ -19016,7 +19044,7 @@
             <w:tcBorders>
               <w:bottom w:val="nil"/>
             </w:tcBorders>
-            <w:shd w:val="clear" w:color="auto" w:fill="E7E6E6" w:themeFill="background2"/>
+            <w:shd w:val="clear" w:color="auto" w:fill="auto"/>
           </w:tcPr>
           <w:p>
             <w:pPr>
@@ -19052,22 +19080,22 @@
             <w:tcBorders>
               <w:bottom w:val="nil"/>
             </w:tcBorders>
-            <w:shd w:val="clear" w:color="auto" w:fill="E7E6E6" w:themeFill="background2"/>
-          </w:tcPr>
-          <w:p>
-            <w:pPr>
-              <w:jc w:val="right"/>
-              <w:rPr>
-                <w:sz w:val="16"/>
-                <w:szCs w:val="16"/>
-              </w:rPr>
-            </w:pPr>
-            <w:r>
-              <w:rPr>
-                <w:sz w:val="16"/>
-                <w:szCs w:val="16"/>
-              </w:rPr>
-              <w:t>-6.813</w:t>
+            <w:shd w:val="clear" w:color="auto" w:fill="auto"/>
+          </w:tcPr>
+          <w:p>
+            <w:pPr>
+              <w:jc w:val="right"/>
+              <w:rPr>
+                <w:sz w:val="16"/>
+                <w:szCs w:val="16"/>
+              </w:rPr>
+            </w:pPr>
+            <w:r>
+              <w:rPr>
+                <w:sz w:val="16"/>
+                <w:szCs w:val="16"/>
+              </w:rPr>
+              <w:t>-6.794</w:t>
             </w:r>
           </w:p>
         </w:tc>
@@ -19077,7 +19105,7 @@
             <w:tcBorders>
               <w:bottom w:val="nil"/>
             </w:tcBorders>
-            <w:shd w:val="clear" w:color="auto" w:fill="E7E6E6" w:themeFill="background2"/>
+            <w:shd w:val="clear" w:color="auto" w:fill="auto"/>
           </w:tcPr>
           <w:p>
             <w:pPr>
@@ -19115,22 +19143,22 @@
             <w:tcBorders>
               <w:bottom w:val="nil"/>
             </w:tcBorders>
-            <w:shd w:val="clear" w:color="auto" w:fill="E7E6E6" w:themeFill="background2"/>
-          </w:tcPr>
-          <w:p>
-            <w:pPr>
-              <w:jc w:val="right"/>
-              <w:rPr>
-                <w:sz w:val="16"/>
-                <w:szCs w:val="16"/>
-              </w:rPr>
-            </w:pPr>
-            <w:r>
-              <w:rPr>
-                <w:sz w:val="16"/>
-                <w:szCs w:val="16"/>
-              </w:rPr>
-              <w:t>-1.196</w:t>
+            <w:shd w:val="clear" w:color="auto" w:fill="auto"/>
+          </w:tcPr>
+          <w:p>
+            <w:pPr>
+              <w:jc w:val="right"/>
+              <w:rPr>
+                <w:sz w:val="16"/>
+                <w:szCs w:val="16"/>
+              </w:rPr>
+            </w:pPr>
+            <w:r>
+              <w:rPr>
+                <w:sz w:val="16"/>
+                <w:szCs w:val="16"/>
+              </w:rPr>
+              <w:t>-1.254</w:t>
             </w:r>
           </w:p>
         </w:tc>
@@ -19140,24 +19168,24 @@
             <w:tcBorders>
               <w:bottom w:val="nil"/>
             </w:tcBorders>
-            <w:shd w:val="clear" w:color="auto" w:fill="E7E6E6" w:themeFill="background2"/>
-          </w:tcPr>
-          <w:p>
-            <w:pPr>
-              <w:jc w:val="right"/>
-              <w:rPr>
-                <w:rFonts w:cstheme="minorHAnsi"/>
-                <w:sz w:val="16"/>
-                <w:szCs w:val="16"/>
-              </w:rPr>
-            </w:pPr>
-            <w:r>
-              <w:rPr>
-                <w:rFonts w:cstheme="minorHAnsi"/>
-                <w:sz w:val="16"/>
-                <w:szCs w:val="16"/>
-              </w:rPr>
-              <w:t>5</w:t>
+            <w:shd w:val="clear" w:color="auto" w:fill="auto"/>
+          </w:tcPr>
+          <w:p>
+            <w:pPr>
+              <w:jc w:val="right"/>
+              <w:rPr>
+                <w:rFonts w:cstheme="minorHAnsi"/>
+                <w:sz w:val="16"/>
+                <w:szCs w:val="16"/>
+              </w:rPr>
+            </w:pPr>
+            <w:r>
+              <w:rPr>
+                <w:rFonts w:cstheme="minorHAnsi"/>
+                <w:sz w:val="16"/>
+                <w:szCs w:val="16"/>
+              </w:rPr>
+              <w:t>4</w:t>
             </w:r>
             <w:r>
               <w:rPr>
@@ -19173,7 +19201,7 @@
                 <w:sz w:val="16"/>
                 <w:szCs w:val="16"/>
               </w:rPr>
-              <w:t>2</w:t>
+              <w:t>1</w:t>
             </w:r>
             <w:r>
               <w:rPr>
@@ -19211,7 +19239,7 @@
               <w:top w:val="nil"/>
               <w:bottom w:val="nil"/>
             </w:tcBorders>
-            <w:shd w:val="clear" w:color="auto" w:fill="E7E6E6" w:themeFill="background2"/>
+            <w:shd w:val="clear" w:color="auto" w:fill="auto"/>
           </w:tcPr>
           <w:p>
             <w:pPr>
@@ -19233,7 +19261,7 @@
               <w:top w:val="nil"/>
               <w:bottom w:val="nil"/>
             </w:tcBorders>
-            <w:shd w:val="clear" w:color="auto" w:fill="E7E6E6" w:themeFill="background2"/>
+            <w:shd w:val="clear" w:color="auto" w:fill="auto"/>
           </w:tcPr>
           <w:p>
             <w:pPr>
@@ -19252,7 +19280,7 @@
               <w:top w:val="nil"/>
               <w:bottom w:val="nil"/>
             </w:tcBorders>
-            <w:shd w:val="clear" w:color="auto" w:fill="E7E6E6" w:themeFill="background2"/>
+            <w:shd w:val="clear" w:color="auto" w:fill="auto"/>
           </w:tcPr>
           <w:p>
             <w:pPr>
@@ -19289,22 +19317,22 @@
               <w:top w:val="nil"/>
               <w:bottom w:val="nil"/>
             </w:tcBorders>
-            <w:shd w:val="clear" w:color="auto" w:fill="E7E6E6" w:themeFill="background2"/>
-          </w:tcPr>
-          <w:p>
-            <w:pPr>
-              <w:jc w:val="right"/>
-              <w:rPr>
-                <w:sz w:val="16"/>
-                <w:szCs w:val="16"/>
-              </w:rPr>
-            </w:pPr>
-            <w:r>
-              <w:rPr>
-                <w:sz w:val="16"/>
-                <w:szCs w:val="16"/>
-              </w:rPr>
-              <w:t>-6.066</w:t>
+            <w:shd w:val="clear" w:color="auto" w:fill="auto"/>
+          </w:tcPr>
+          <w:p>
+            <w:pPr>
+              <w:jc w:val="right"/>
+              <w:rPr>
+                <w:sz w:val="16"/>
+                <w:szCs w:val="16"/>
+              </w:rPr>
+            </w:pPr>
+            <w:r>
+              <w:rPr>
+                <w:sz w:val="16"/>
+                <w:szCs w:val="16"/>
+              </w:rPr>
+              <w:t>-6.060</w:t>
             </w:r>
           </w:p>
         </w:tc>
@@ -19315,7 +19343,7 @@
               <w:top w:val="nil"/>
               <w:bottom w:val="nil"/>
             </w:tcBorders>
-            <w:shd w:val="clear" w:color="auto" w:fill="E7E6E6" w:themeFill="background2"/>
+            <w:shd w:val="clear" w:color="auto" w:fill="auto"/>
           </w:tcPr>
           <w:p>
             <w:pPr>
@@ -19354,22 +19382,37 @@
               <w:top w:val="nil"/>
               <w:bottom w:val="nil"/>
             </w:tcBorders>
-            <w:shd w:val="clear" w:color="auto" w:fill="E7E6E6" w:themeFill="background2"/>
-          </w:tcPr>
-          <w:p>
-            <w:pPr>
-              <w:jc w:val="right"/>
-              <w:rPr>
-                <w:sz w:val="16"/>
-                <w:szCs w:val="16"/>
-              </w:rPr>
-            </w:pPr>
-            <w:r>
-              <w:rPr>
-                <w:sz w:val="16"/>
-                <w:szCs w:val="16"/>
-              </w:rPr>
-              <w:t>-1.867</w:t>
+            <w:shd w:val="clear" w:color="auto" w:fill="auto"/>
+          </w:tcPr>
+          <w:p>
+            <w:pPr>
+              <w:jc w:val="right"/>
+              <w:rPr>
+                <w:sz w:val="16"/>
+                <w:szCs w:val="16"/>
+              </w:rPr>
+            </w:pPr>
+            <w:r>
+              <w:rPr>
+                <w:sz w:val="16"/>
+                <w:szCs w:val="16"/>
+              </w:rPr>
+              <w:t>-1</w:t>
+            </w:r>
+            <w:r>
+              <w:rPr>
+                <w:sz w:val="16"/>
+                <w:szCs w:val="16"/>
+                <w:lang w:val="en-US"/>
+              </w:rPr>
+              <w:t>.</w:t>
+            </w:r>
+            <w:r>
+              <w:rPr>
+                <w:sz w:val="16"/>
+                <w:szCs w:val="16"/>
+              </w:rPr>
+              <w:t>908</w:t>
             </w:r>
           </w:p>
         </w:tc>
@@ -19380,24 +19423,32 @@
               <w:top w:val="nil"/>
               <w:bottom w:val="nil"/>
             </w:tcBorders>
-            <w:shd w:val="clear" w:color="auto" w:fill="E7E6E6" w:themeFill="background2"/>
-          </w:tcPr>
-          <w:p>
-            <w:pPr>
-              <w:jc w:val="right"/>
-              <w:rPr>
-                <w:rFonts w:cstheme="minorHAnsi"/>
-                <w:sz w:val="16"/>
-                <w:szCs w:val="16"/>
-              </w:rPr>
-            </w:pPr>
-            <w:r>
-              <w:rPr>
-                <w:rFonts w:cstheme="minorHAnsi"/>
-                <w:sz w:val="16"/>
-                <w:szCs w:val="16"/>
-              </w:rPr>
-              <w:t>93</w:t>
+            <w:shd w:val="clear" w:color="auto" w:fill="auto"/>
+          </w:tcPr>
+          <w:p>
+            <w:pPr>
+              <w:jc w:val="right"/>
+              <w:rPr>
+                <w:rFonts w:cstheme="minorHAnsi"/>
+                <w:sz w:val="16"/>
+                <w:szCs w:val="16"/>
+              </w:rPr>
+            </w:pPr>
+            <w:r>
+              <w:rPr>
+                <w:rFonts w:cstheme="minorHAnsi"/>
+                <w:sz w:val="16"/>
+                <w:szCs w:val="16"/>
+              </w:rPr>
+              <w:t>9</w:t>
+            </w:r>
+            <w:r>
+              <w:rPr>
+                <w:rFonts w:cstheme="minorHAnsi"/>
+                <w:sz w:val="16"/>
+                <w:szCs w:val="16"/>
+              </w:rPr>
+              <w:t>4</w:t>
             </w:r>
             <w:r>
               <w:rPr>
@@ -19413,7 +19464,7 @@
                 <w:sz w:val="16"/>
                 <w:szCs w:val="16"/>
               </w:rPr>
-              <w:t>6</w:t>
+              <w:t>4</w:t>
             </w:r>
             <w:r>
               <w:rPr>
@@ -19451,12 +19502,14 @@
               <w:top w:val="nil"/>
               <w:bottom w:val="nil"/>
             </w:tcBorders>
-          </w:tcPr>
-          <w:p>
-            <w:pPr>
-              <w:jc w:val="right"/>
-              <w:rPr>
-                <w:rFonts w:cstheme="minorHAnsi"/>
+            <w:shd w:val="clear" w:color="auto" w:fill="auto"/>
+          </w:tcPr>
+          <w:p>
+            <w:pPr>
+              <w:jc w:val="right"/>
+              <w:rPr>
+                <w:rFonts w:cstheme="minorHAnsi"/>
+                <w:b/>
                 <w:i/>
                 <w:sz w:val="16"/>
                 <w:szCs w:val="16"/>
@@ -19465,6 +19518,7 @@
             <w:r>
               <w:rPr>
                 <w:rFonts w:cstheme="minorHAnsi"/>
+                <w:b/>
                 <w:i/>
                 <w:sz w:val="16"/>
                 <w:szCs w:val="16"/>
@@ -19474,6 +19528,7 @@
             <w:r>
               <w:rPr>
                 <w:rFonts w:cstheme="minorHAnsi"/>
+                <w:b/>
                 <w:i/>
                 <w:sz w:val="16"/>
                 <w:szCs w:val="16"/>
@@ -19491,21 +19546,40 @@
               <w:top w:val="nil"/>
               <w:bottom w:val="nil"/>
             </w:tcBorders>
-          </w:tcPr>
-          <w:p>
-            <w:pPr>
-              <w:jc w:val="right"/>
-              <w:rPr>
-                <w:sz w:val="16"/>
-                <w:szCs w:val="16"/>
-              </w:rPr>
-            </w:pPr>
-            <w:r>
-              <w:rPr>
-                <w:sz w:val="16"/>
-                <w:szCs w:val="16"/>
-              </w:rPr>
-              <w:t>1.914</w:t>
+            <w:shd w:val="clear" w:color="auto" w:fill="auto"/>
+          </w:tcPr>
+          <w:p>
+            <w:pPr>
+              <w:jc w:val="right"/>
+              <w:rPr>
+                <w:b/>
+                <w:sz w:val="16"/>
+                <w:szCs w:val="16"/>
+              </w:rPr>
+            </w:pPr>
+            <w:r>
+              <w:rPr>
+                <w:b/>
+                <w:sz w:val="16"/>
+                <w:szCs w:val="16"/>
+              </w:rPr>
+              <w:t>1.9</w:t>
+            </w:r>
+            <w:r>
+              <w:rPr>
+                <w:b/>
+                <w:sz w:val="16"/>
+                <w:szCs w:val="16"/>
+              </w:rPr>
+              <w:t>4</w:t>
+            </w:r>
+            <w:r>
+              <w:rPr>
+                <w:b/>
+                <w:sz w:val="16"/>
+                <w:szCs w:val="16"/>
+              </w:rPr>
+              <w:t>0</w:t>
             </w:r>
           </w:p>
         </w:tc>
@@ -19516,6 +19590,7 @@
               <w:top w:val="nil"/>
               <w:bottom w:val="nil"/>
             </w:tcBorders>
+            <w:shd w:val="clear" w:color="auto" w:fill="auto"/>
           </w:tcPr>
           <w:p>
             <w:pPr>
@@ -19552,21 +19627,24 @@
               <w:top w:val="nil"/>
               <w:bottom w:val="nil"/>
             </w:tcBorders>
-          </w:tcPr>
-          <w:p>
-            <w:pPr>
-              <w:jc w:val="right"/>
-              <w:rPr>
-                <w:sz w:val="16"/>
-                <w:szCs w:val="16"/>
-              </w:rPr>
-            </w:pPr>
-            <w:r>
-              <w:rPr>
-                <w:sz w:val="16"/>
-                <w:szCs w:val="16"/>
-              </w:rPr>
-              <w:t>-6.813</w:t>
+            <w:shd w:val="clear" w:color="auto" w:fill="auto"/>
+          </w:tcPr>
+          <w:p>
+            <w:pPr>
+              <w:jc w:val="right"/>
+              <w:rPr>
+                <w:sz w:val="16"/>
+                <w:szCs w:val="16"/>
+                <w:lang w:val="en-US"/>
+              </w:rPr>
+            </w:pPr>
+            <w:r>
+              <w:rPr>
+                <w:sz w:val="16"/>
+                <w:szCs w:val="16"/>
+                <w:lang w:val="en-US"/>
+              </w:rPr>
+              <w:t>-6.794</w:t>
             </w:r>
           </w:p>
         </w:tc>
@@ -19577,6 +19655,7 @@
               <w:top w:val="nil"/>
               <w:bottom w:val="nil"/>
             </w:tcBorders>
+            <w:shd w:val="clear" w:color="auto" w:fill="auto"/>
           </w:tcPr>
           <w:p>
             <w:pPr>
@@ -19585,6 +19664,7 @@
                 <w:i/>
                 <w:sz w:val="16"/>
                 <w:szCs w:val="16"/>
+                <w:lang w:val="en-US"/>
               </w:rPr>
             </w:pPr>
             <w:proofErr w:type="spellStart"/>
@@ -19593,6 +19673,7 @@
                 <w:i/>
                 <w:sz w:val="16"/>
                 <w:szCs w:val="16"/>
+                <w:lang w:val="en-US"/>
               </w:rPr>
               <w:t>e</w:t>
             </w:r>
@@ -19602,6 +19683,7 @@
                 <w:sz w:val="16"/>
                 <w:szCs w:val="16"/>
                 <w:vertAlign w:val="subscript"/>
+                <w:lang w:val="en-US"/>
               </w:rPr>
               <w:t>u</w:t>
             </w:r>
@@ -19615,21 +19697,37 @@
               <w:top w:val="nil"/>
               <w:bottom w:val="nil"/>
             </w:tcBorders>
-          </w:tcPr>
-          <w:p>
-            <w:pPr>
-              <w:jc w:val="right"/>
-              <w:rPr>
-                <w:sz w:val="16"/>
-                <w:szCs w:val="16"/>
-              </w:rPr>
-            </w:pPr>
-            <w:r>
-              <w:rPr>
-                <w:sz w:val="16"/>
-                <w:szCs w:val="16"/>
-              </w:rPr>
-              <w:t>-1.867</w:t>
+            <w:shd w:val="clear" w:color="auto" w:fill="auto"/>
+          </w:tcPr>
+          <w:p>
+            <w:pPr>
+              <w:jc w:val="right"/>
+              <w:rPr>
+                <w:sz w:val="16"/>
+                <w:szCs w:val="16"/>
+              </w:rPr>
+            </w:pPr>
+            <w:r>
+              <w:rPr>
+                <w:sz w:val="16"/>
+                <w:szCs w:val="16"/>
+              </w:rPr>
+              <w:t>-1</w:t>
+            </w:r>
+            <w:r>
+              <w:rPr>
+                <w:sz w:val="16"/>
+                <w:szCs w:val="16"/>
+                <w:lang w:val="en-US"/>
+              </w:rPr>
+              <w:t>.</w:t>
+            </w:r>
+            <w:r>
+              <w:rPr>
+                <w:sz w:val="16"/>
+                <w:szCs w:val="16"/>
+              </w:rPr>
+              <w:t>908</w:t>
             </w:r>
           </w:p>
         </w:tc>
@@ -19640,45 +19738,33 @@
               <w:top w:val="nil"/>
               <w:bottom w:val="nil"/>
             </w:tcBorders>
-          </w:tcPr>
-          <w:p>
-            <w:pPr>
-              <w:jc w:val="right"/>
-              <w:rPr>
-                <w:rFonts w:cstheme="minorHAnsi"/>
-                <w:sz w:val="16"/>
-                <w:szCs w:val="16"/>
-              </w:rPr>
-            </w:pPr>
-            <w:r>
-              <w:rPr>
-                <w:rFonts w:cstheme="minorHAnsi"/>
-                <w:sz w:val="16"/>
-                <w:szCs w:val="16"/>
-              </w:rPr>
-              <w:t>39</w:t>
-            </w:r>
-            <w:r>
-              <w:rPr>
-                <w:rFonts w:cstheme="minorHAnsi"/>
-                <w:sz w:val="16"/>
-                <w:szCs w:val="16"/>
-              </w:rPr>
-              <w:t>.</w:t>
-            </w:r>
-            <w:r>
-              <w:rPr>
-                <w:rFonts w:cstheme="minorHAnsi"/>
-                <w:sz w:val="16"/>
-                <w:szCs w:val="16"/>
-              </w:rPr>
-              <w:t>9</w:t>
-            </w:r>
-            <w:r>
-              <w:rPr>
-                <w:rFonts w:cstheme="minorHAnsi"/>
-                <w:sz w:val="16"/>
-                <w:szCs w:val="16"/>
+            <w:shd w:val="clear" w:color="auto" w:fill="auto"/>
+          </w:tcPr>
+          <w:p>
+            <w:pPr>
+              <w:jc w:val="right"/>
+              <w:rPr>
+                <w:rFonts w:cstheme="minorHAnsi"/>
+                <w:sz w:val="16"/>
+                <w:szCs w:val="16"/>
+                <w:lang w:val="en-US"/>
+              </w:rPr>
+            </w:pPr>
+            <w:r>
+              <w:rPr>
+                <w:rFonts w:cstheme="minorHAnsi"/>
+                <w:sz w:val="16"/>
+                <w:szCs w:val="16"/>
+                <w:lang w:val="en-US"/>
+              </w:rPr>
+              <w:t>38.1</w:t>
+            </w:r>
+            <w:r>
+              <w:rPr>
+                <w:rFonts w:cstheme="minorHAnsi"/>
+                <w:sz w:val="16"/>
+                <w:szCs w:val="16"/>
+                <w:lang w:val="en-US"/>
               </w:rPr>
               <w:t>%</w:t>
             </w:r>
@@ -19713,6 +19799,7 @@
               <w:top w:val="nil"/>
               <w:bottom w:val="single" w:sz="4" w:space="0" w:color="auto"/>
             </w:tcBorders>
+            <w:shd w:val="clear" w:color="auto" w:fill="auto"/>
           </w:tcPr>
           <w:p>
             <w:pPr>
@@ -19722,6 +19809,7 @@
                 <w:i/>
                 <w:sz w:val="16"/>
                 <w:szCs w:val="16"/>
+                <w:lang w:val="en-US"/>
               </w:rPr>
             </w:pPr>
           </w:p>
@@ -19734,13 +19822,15 @@
               <w:top w:val="nil"/>
               <w:bottom w:val="single" w:sz="4" w:space="0" w:color="auto"/>
             </w:tcBorders>
-          </w:tcPr>
-          <w:p>
-            <w:pPr>
-              <w:jc w:val="right"/>
-              <w:rPr>
-                <w:sz w:val="16"/>
-                <w:szCs w:val="16"/>
+            <w:shd w:val="clear" w:color="auto" w:fill="auto"/>
+          </w:tcPr>
+          <w:p>
+            <w:pPr>
+              <w:jc w:val="right"/>
+              <w:rPr>
+                <w:sz w:val="16"/>
+                <w:szCs w:val="16"/>
+                <w:lang w:val="en-US"/>
               </w:rPr>
             </w:pPr>
           </w:p>
@@ -19752,6 +19842,7 @@
               <w:top w:val="nil"/>
               <w:bottom w:val="single" w:sz="4" w:space="0" w:color="auto"/>
             </w:tcBorders>
+            <w:shd w:val="clear" w:color="auto" w:fill="auto"/>
           </w:tcPr>
           <w:p>
             <w:pPr>
@@ -19760,6 +19851,7 @@
                 <w:i/>
                 <w:sz w:val="16"/>
                 <w:szCs w:val="16"/>
+                <w:lang w:val="en-US"/>
               </w:rPr>
             </w:pPr>
             <w:r>
@@ -19767,6 +19859,7 @@
                 <w:i/>
                 <w:sz w:val="16"/>
                 <w:szCs w:val="16"/>
+                <w:lang w:val="en-US"/>
               </w:rPr>
               <w:t>a</w:t>
             </w:r>
@@ -19776,6 +19869,7 @@
                 <w:sz w:val="16"/>
                 <w:szCs w:val="16"/>
                 <w:vertAlign w:val="subscript"/>
+                <w:lang w:val="en-US"/>
               </w:rPr>
               <w:t>1u</w:t>
             </w:r>
@@ -19788,21 +19882,24 @@
               <w:top w:val="nil"/>
               <w:bottom w:val="single" w:sz="4" w:space="0" w:color="auto"/>
             </w:tcBorders>
-          </w:tcPr>
-          <w:p>
-            <w:pPr>
-              <w:jc w:val="right"/>
-              <w:rPr>
-                <w:sz w:val="16"/>
-                <w:szCs w:val="16"/>
-              </w:rPr>
-            </w:pPr>
-            <w:r>
-              <w:rPr>
-                <w:sz w:val="16"/>
-                <w:szCs w:val="16"/>
-              </w:rPr>
-              <w:t>-6.066</w:t>
+            <w:shd w:val="clear" w:color="auto" w:fill="auto"/>
+          </w:tcPr>
+          <w:p>
+            <w:pPr>
+              <w:jc w:val="right"/>
+              <w:rPr>
+                <w:sz w:val="16"/>
+                <w:szCs w:val="16"/>
+                <w:lang w:val="en-US"/>
+              </w:rPr>
+            </w:pPr>
+            <w:r>
+              <w:rPr>
+                <w:sz w:val="16"/>
+                <w:szCs w:val="16"/>
+                <w:lang w:val="en-US"/>
+              </w:rPr>
+              <w:t>-6.060</w:t>
             </w:r>
           </w:p>
         </w:tc>
@@ -19813,6 +19910,7 @@
               <w:top w:val="nil"/>
               <w:bottom w:val="single" w:sz="4" w:space="0" w:color="auto"/>
             </w:tcBorders>
+            <w:shd w:val="clear" w:color="auto" w:fill="auto"/>
           </w:tcPr>
           <w:p>
             <w:pPr>
@@ -19821,6 +19919,7 @@
                 <w:i/>
                 <w:sz w:val="16"/>
                 <w:szCs w:val="16"/>
+                <w:lang w:val="en-US"/>
               </w:rPr>
             </w:pPr>
             <w:proofErr w:type="spellStart"/>
@@ -19829,6 +19928,7 @@
                 <w:i/>
                 <w:sz w:val="16"/>
                 <w:szCs w:val="16"/>
+                <w:lang w:val="en-US"/>
               </w:rPr>
               <w:t>e</w:t>
             </w:r>
@@ -19838,6 +19938,7 @@
                 <w:sz w:val="16"/>
                 <w:szCs w:val="16"/>
                 <w:vertAlign w:val="subscript"/>
+                <w:lang w:val="en-US"/>
               </w:rPr>
               <w:t>g</w:t>
             </w:r>
@@ -19851,21 +19952,23 @@
               <w:top w:val="nil"/>
               <w:bottom w:val="single" w:sz="4" w:space="0" w:color="auto"/>
             </w:tcBorders>
-          </w:tcPr>
-          <w:p>
-            <w:pPr>
-              <w:jc w:val="right"/>
-              <w:rPr>
-                <w:sz w:val="16"/>
-                <w:szCs w:val="16"/>
-              </w:rPr>
-            </w:pPr>
-            <w:r>
-              <w:rPr>
-                <w:sz w:val="16"/>
-                <w:szCs w:val="16"/>
-              </w:rPr>
-              <w:t>-1.196</w:t>
+            <w:shd w:val="clear" w:color="auto" w:fill="auto"/>
+          </w:tcPr>
+          <w:p>
+            <w:pPr>
+              <w:jc w:val="right"/>
+              <w:rPr>
+                <w:sz w:val="16"/>
+                <w:szCs w:val="16"/>
+                <w:lang w:val="en-US"/>
+              </w:rPr>
+            </w:pPr>
+            <w:r>
+              <w:rPr>
+                <w:sz w:val="16"/>
+                <w:szCs w:val="16"/>
+              </w:rPr>
+              <w:t>-1.254</w:t>
             </w:r>
           </w:p>
         </w:tc>
@@ -19876,45 +19979,42 @@
               <w:top w:val="nil"/>
               <w:bottom w:val="single" w:sz="4" w:space="0" w:color="auto"/>
             </w:tcBorders>
-          </w:tcPr>
-          <w:p>
-            <w:pPr>
-              <w:jc w:val="right"/>
-              <w:rPr>
-                <w:rFonts w:cstheme="minorHAnsi"/>
-                <w:sz w:val="16"/>
-                <w:szCs w:val="16"/>
-              </w:rPr>
-            </w:pPr>
-            <w:r>
-              <w:rPr>
-                <w:rFonts w:cstheme="minorHAnsi"/>
-                <w:sz w:val="16"/>
-                <w:szCs w:val="16"/>
-              </w:rPr>
-              <w:t>51</w:t>
-            </w:r>
-            <w:r>
-              <w:rPr>
-                <w:rFonts w:cstheme="minorHAnsi"/>
-                <w:sz w:val="16"/>
-                <w:szCs w:val="16"/>
-              </w:rPr>
-              <w:t>.</w:t>
-            </w:r>
-            <w:r>
-              <w:rPr>
-                <w:rFonts w:cstheme="minorHAnsi"/>
-                <w:sz w:val="16"/>
-                <w:szCs w:val="16"/>
-              </w:rPr>
-              <w:t>3</w:t>
-            </w:r>
-            <w:r>
-              <w:rPr>
-                <w:rFonts w:cstheme="minorHAnsi"/>
-                <w:sz w:val="16"/>
-                <w:szCs w:val="16"/>
+            <w:shd w:val="clear" w:color="auto" w:fill="auto"/>
+          </w:tcPr>
+          <w:p>
+            <w:pPr>
+              <w:jc w:val="right"/>
+              <w:rPr>
+                <w:rFonts w:cstheme="minorHAnsi"/>
+                <w:sz w:val="16"/>
+                <w:szCs w:val="16"/>
+                <w:lang w:val="en-US"/>
+              </w:rPr>
+            </w:pPr>
+            <w:r>
+              <w:rPr>
+                <w:rFonts w:cstheme="minorHAnsi"/>
+                <w:sz w:val="16"/>
+                <w:szCs w:val="16"/>
+                <w:lang w:val="en-US"/>
+              </w:rPr>
+              <w:t>53</w:t>
+            </w:r>
+            <w:r>
+              <w:rPr>
+                <w:rFonts w:cstheme="minorHAnsi"/>
+                <w:sz w:val="16"/>
+                <w:szCs w:val="16"/>
+                <w:lang w:val="en-US"/>
+              </w:rPr>
+              <w:t>.0</w:t>
+            </w:r>
+            <w:r>
+              <w:rPr>
+                <w:rFonts w:cstheme="minorHAnsi"/>
+                <w:sz w:val="16"/>
+                <w:szCs w:val="16"/>
+                <w:lang w:val="en-US"/>
               </w:rPr>
               <w:t>%</w:t>
             </w:r>
@@ -19937,13 +20037,16 @@
                 <w:rFonts w:cstheme="minorHAnsi"/>
                 <w:sz w:val="16"/>
                 <w:szCs w:val="16"/>
-              </w:rPr>
-            </w:pPr>
-            <w:r>
-              <w:rPr>
-                <w:rFonts w:cstheme="minorHAnsi"/>
-                <w:sz w:val="16"/>
-                <w:szCs w:val="16"/>
+                <w:lang w:val="en-US"/>
+              </w:rPr>
+            </w:pPr>
+            <w:r>
+              <w:rPr>
+                <w:rFonts w:cstheme="minorHAnsi"/>
+                <w:sz w:val="16"/>
+                <w:szCs w:val="16"/>
+                <w:highlight w:val="green"/>
+                <w:lang w:val="en-US"/>
               </w:rPr>
               <w:t>4.0</w:t>
             </w:r>
@@ -19956,7 +20059,7 @@
             <w:tcBorders>
               <w:bottom w:val="nil"/>
             </w:tcBorders>
-            <w:shd w:val="clear" w:color="auto" w:fill="E7E6E6" w:themeFill="background2"/>
+            <w:shd w:val="clear" w:color="auto" w:fill="auto"/>
           </w:tcPr>
           <w:p>
             <w:pPr>
@@ -19966,6 +20069,7 @@
                 <w:i/>
                 <w:sz w:val="16"/>
                 <w:szCs w:val="16"/>
+                <w:lang w:val="en-US"/>
               </w:rPr>
             </w:pPr>
             <w:r>
@@ -19974,6 +20078,7 @@
                 <w:i/>
                 <w:sz w:val="16"/>
                 <w:szCs w:val="16"/>
+                <w:lang w:val="en-US"/>
               </w:rPr>
               <w:t>E</w:t>
             </w:r>
@@ -19984,6 +20089,7 @@
                 <w:sz w:val="16"/>
                 <w:szCs w:val="16"/>
                 <w:vertAlign w:val="subscript"/>
+                <w:lang w:val="en-US"/>
               </w:rPr>
               <w:t>G</w:t>
             </w:r>
@@ -19996,23 +20102,34 @@
             <w:tcBorders>
               <w:bottom w:val="nil"/>
             </w:tcBorders>
-            <w:shd w:val="clear" w:color="auto" w:fill="E7E6E6" w:themeFill="background2"/>
-          </w:tcPr>
-          <w:p>
-            <w:pPr>
-              <w:jc w:val="right"/>
-              <w:rPr>
-                <w:sz w:val="16"/>
-                <w:szCs w:val="16"/>
-              </w:rPr>
-            </w:pPr>
-            <w:r>
-              <w:rPr>
-                <w:rFonts w:cstheme="minorHAnsi"/>
-                <w:sz w:val="16"/>
-                <w:szCs w:val="16"/>
-              </w:rPr>
-              <w:t>1.520</w:t>
+            <w:shd w:val="clear" w:color="auto" w:fill="auto"/>
+          </w:tcPr>
+          <w:p>
+            <w:pPr>
+              <w:jc w:val="right"/>
+              <w:rPr>
+                <w:sz w:val="16"/>
+                <w:szCs w:val="16"/>
+                <w:lang w:val="en-US"/>
+              </w:rPr>
+            </w:pPr>
+            <w:r>
+              <w:rPr>
+                <w:rFonts w:cstheme="minorHAnsi"/>
+                <w:sz w:val="16"/>
+                <w:szCs w:val="16"/>
+                <w:lang w:val="en-US"/>
+              </w:rPr>
+              <w:t>1.</w:t>
+            </w:r>
+            <w:r>
+              <w:rPr>
+                <w:rFonts w:cstheme="minorHAnsi"/>
+                <w:sz w:val="16"/>
+                <w:szCs w:val="16"/>
+                <w:lang w:val="en-US"/>
+              </w:rPr>
+              <w:t>554</w:t>
             </w:r>
           </w:p>
         </w:tc>
@@ -20022,7 +20139,7 @@
             <w:tcBorders>
               <w:bottom w:val="nil"/>
             </w:tcBorders>
-            <w:shd w:val="clear" w:color="auto" w:fill="E7E6E6" w:themeFill="background2"/>
+            <w:shd w:val="clear" w:color="auto" w:fill="auto"/>
           </w:tcPr>
           <w:p>
             <w:pPr>
@@ -20031,6 +20148,7 @@
                 <w:i/>
                 <w:sz w:val="16"/>
                 <w:szCs w:val="16"/>
+                <w:lang w:val="en-US"/>
               </w:rPr>
             </w:pPr>
             <w:r>
@@ -20038,6 +20156,7 @@
                 <w:i/>
                 <w:sz w:val="16"/>
                 <w:szCs w:val="16"/>
+                <w:lang w:val="en-US"/>
               </w:rPr>
               <w:t>a</w:t>
             </w:r>
@@ -20047,6 +20166,7 @@
                 <w:sz w:val="16"/>
                 <w:szCs w:val="16"/>
                 <w:vertAlign w:val="subscript"/>
+                <w:lang w:val="en-US"/>
               </w:rPr>
               <w:t>2g</w:t>
             </w:r>
@@ -20058,22 +20178,24 @@
             <w:tcBorders>
               <w:bottom w:val="nil"/>
             </w:tcBorders>
-            <w:shd w:val="clear" w:color="auto" w:fill="E7E6E6" w:themeFill="background2"/>
-          </w:tcPr>
-          <w:p>
-            <w:pPr>
-              <w:jc w:val="right"/>
-              <w:rPr>
-                <w:sz w:val="16"/>
-                <w:szCs w:val="16"/>
-              </w:rPr>
-            </w:pPr>
-            <w:r>
-              <w:rPr>
-                <w:sz w:val="16"/>
-                <w:szCs w:val="16"/>
-              </w:rPr>
-              <w:t>-6.617</w:t>
+            <w:shd w:val="clear" w:color="auto" w:fill="auto"/>
+          </w:tcPr>
+          <w:p>
+            <w:pPr>
+              <w:jc w:val="right"/>
+              <w:rPr>
+                <w:sz w:val="16"/>
+                <w:szCs w:val="16"/>
+                <w:lang w:val="en-US"/>
+              </w:rPr>
+            </w:pPr>
+            <w:r>
+              <w:rPr>
+                <w:sz w:val="16"/>
+                <w:szCs w:val="16"/>
+                <w:lang w:val="en-US"/>
+              </w:rPr>
+              <w:t>-6.602</w:t>
             </w:r>
           </w:p>
         </w:tc>
@@ -20083,7 +20205,7 @@
             <w:tcBorders>
               <w:bottom w:val="nil"/>
             </w:tcBorders>
-            <w:shd w:val="clear" w:color="auto" w:fill="E7E6E6" w:themeFill="background2"/>
+            <w:shd w:val="clear" w:color="auto" w:fill="auto"/>
           </w:tcPr>
           <w:p>
             <w:pPr>
@@ -20092,6 +20214,7 @@
                 <w:i/>
                 <w:sz w:val="16"/>
                 <w:szCs w:val="16"/>
+                <w:lang w:val="en-US"/>
               </w:rPr>
             </w:pPr>
             <w:proofErr w:type="spellStart"/>
@@ -20100,6 +20223,7 @@
                 <w:i/>
                 <w:sz w:val="16"/>
                 <w:szCs w:val="16"/>
+                <w:lang w:val="en-US"/>
               </w:rPr>
               <w:t>e</w:t>
             </w:r>
@@ -20109,6 +20233,7 @@
                 <w:sz w:val="16"/>
                 <w:szCs w:val="16"/>
                 <w:vertAlign w:val="subscript"/>
+                <w:lang w:val="en-US"/>
               </w:rPr>
               <w:t>g</w:t>
             </w:r>
@@ -20121,22 +20246,30 @@
             <w:tcBorders>
               <w:bottom w:val="nil"/>
             </w:tcBorders>
-            <w:shd w:val="clear" w:color="auto" w:fill="E7E6E6" w:themeFill="background2"/>
-          </w:tcPr>
-          <w:p>
-            <w:pPr>
-              <w:jc w:val="right"/>
-              <w:rPr>
-                <w:sz w:val="16"/>
-                <w:szCs w:val="16"/>
-              </w:rPr>
-            </w:pPr>
-            <w:r>
-              <w:rPr>
-                <w:sz w:val="16"/>
-                <w:szCs w:val="16"/>
-              </w:rPr>
-              <w:t>-1.383</w:t>
+            <w:shd w:val="clear" w:color="auto" w:fill="auto"/>
+          </w:tcPr>
+          <w:p>
+            <w:pPr>
+              <w:jc w:val="right"/>
+              <w:rPr>
+                <w:sz w:val="16"/>
+                <w:szCs w:val="16"/>
+              </w:rPr>
+            </w:pPr>
+            <w:r>
+              <w:rPr>
+                <w:sz w:val="16"/>
+                <w:szCs w:val="16"/>
+                <w:lang w:val="en-US"/>
+              </w:rPr>
+              <w:t>-1.</w:t>
+            </w:r>
+            <w:r>
+              <w:rPr>
+                <w:sz w:val="16"/>
+                <w:szCs w:val="16"/>
+              </w:rPr>
+              <w:t>436</w:t>
             </w:r>
           </w:p>
         </w:tc>
@@ -20146,24 +20279,34 @@
             <w:tcBorders>
               <w:bottom w:val="nil"/>
             </w:tcBorders>
-            <w:shd w:val="clear" w:color="auto" w:fill="E7E6E6" w:themeFill="background2"/>
-          </w:tcPr>
-          <w:p>
-            <w:pPr>
-              <w:jc w:val="right"/>
-              <w:rPr>
-                <w:rFonts w:cstheme="minorHAnsi"/>
-                <w:sz w:val="16"/>
-                <w:szCs w:val="16"/>
-              </w:rPr>
-            </w:pPr>
-            <w:r>
-              <w:rPr>
-                <w:rFonts w:cstheme="minorHAnsi"/>
-                <w:sz w:val="16"/>
-                <w:szCs w:val="16"/>
-              </w:rPr>
-              <w:t>18.5%</w:t>
+            <w:shd w:val="clear" w:color="auto" w:fill="auto"/>
+          </w:tcPr>
+          <w:p>
+            <w:pPr>
+              <w:jc w:val="right"/>
+              <w:rPr>
+                <w:rFonts w:cstheme="minorHAnsi"/>
+                <w:sz w:val="16"/>
+                <w:szCs w:val="16"/>
+                <w:lang w:val="en-US"/>
+              </w:rPr>
+            </w:pPr>
+            <w:r>
+              <w:rPr>
+                <w:rFonts w:cstheme="minorHAnsi"/>
+                <w:sz w:val="16"/>
+                <w:szCs w:val="16"/>
+              </w:rPr>
+              <w:t>16.6</w:t>
+            </w:r>
+            <w:r>
+              <w:rPr>
+                <w:rFonts w:cstheme="minorHAnsi"/>
+                <w:sz w:val="16"/>
+                <w:szCs w:val="16"/>
+                <w:lang w:val="en-US"/>
+              </w:rPr>
+              <w:t>%</w:t>
             </w:r>
           </w:p>
         </w:tc>
@@ -20185,6 +20328,7 @@
                 <w:rFonts w:cstheme="minorHAnsi"/>
                 <w:sz w:val="16"/>
                 <w:szCs w:val="16"/>
+                <w:lang w:val="en-US"/>
               </w:rPr>
             </w:pPr>
           </w:p>
@@ -20197,7 +20341,7 @@
               <w:top w:val="nil"/>
               <w:bottom w:val="nil"/>
             </w:tcBorders>
-            <w:shd w:val="clear" w:color="auto" w:fill="E7E6E6" w:themeFill="background2"/>
+            <w:shd w:val="clear" w:color="auto" w:fill="auto"/>
           </w:tcPr>
           <w:p>
             <w:pPr>
@@ -20207,6 +20351,7 @@
                 <w:i/>
                 <w:sz w:val="16"/>
                 <w:szCs w:val="16"/>
+                <w:lang w:val="en-US"/>
               </w:rPr>
             </w:pPr>
           </w:p>
@@ -20219,14 +20364,15 @@
               <w:top w:val="nil"/>
               <w:bottom w:val="nil"/>
             </w:tcBorders>
-            <w:shd w:val="clear" w:color="auto" w:fill="E7E6E6" w:themeFill="background2"/>
-          </w:tcPr>
-          <w:p>
-            <w:pPr>
-              <w:jc w:val="right"/>
-              <w:rPr>
-                <w:sz w:val="16"/>
-                <w:szCs w:val="16"/>
+            <w:shd w:val="clear" w:color="auto" w:fill="auto"/>
+          </w:tcPr>
+          <w:p>
+            <w:pPr>
+              <w:jc w:val="right"/>
+              <w:rPr>
+                <w:sz w:val="16"/>
+                <w:szCs w:val="16"/>
+                <w:lang w:val="en-US"/>
               </w:rPr>
             </w:pPr>
           </w:p>
@@ -20238,7 +20384,7 @@
               <w:top w:val="nil"/>
               <w:bottom w:val="nil"/>
             </w:tcBorders>
-            <w:shd w:val="clear" w:color="auto" w:fill="E7E6E6" w:themeFill="background2"/>
+            <w:shd w:val="clear" w:color="auto" w:fill="auto"/>
           </w:tcPr>
           <w:p>
             <w:pPr>
@@ -20247,6 +20393,7 @@
                 <w:i/>
                 <w:sz w:val="16"/>
                 <w:szCs w:val="16"/>
+                <w:lang w:val="en-US"/>
               </w:rPr>
             </w:pPr>
             <w:r>
@@ -20254,6 +20401,7 @@
                 <w:i/>
                 <w:sz w:val="16"/>
                 <w:szCs w:val="16"/>
+                <w:lang w:val="en-US"/>
               </w:rPr>
               <w:t>a</w:t>
             </w:r>
@@ -20263,6 +20411,7 @@
                 <w:sz w:val="16"/>
                 <w:szCs w:val="16"/>
                 <w:vertAlign w:val="subscript"/>
+                <w:lang w:val="en-US"/>
               </w:rPr>
               <w:t>1u</w:t>
             </w:r>
@@ -20275,22 +20424,24 @@
               <w:top w:val="nil"/>
               <w:bottom w:val="nil"/>
             </w:tcBorders>
-            <w:shd w:val="clear" w:color="auto" w:fill="E7E6E6" w:themeFill="background2"/>
-          </w:tcPr>
-          <w:p>
-            <w:pPr>
-              <w:jc w:val="right"/>
-              <w:rPr>
-                <w:sz w:val="16"/>
-                <w:szCs w:val="16"/>
-              </w:rPr>
-            </w:pPr>
-            <w:r>
-              <w:rPr>
-                <w:sz w:val="16"/>
-                <w:szCs w:val="16"/>
-              </w:rPr>
-              <w:t>-6.275</w:t>
+            <w:shd w:val="clear" w:color="auto" w:fill="auto"/>
+          </w:tcPr>
+          <w:p>
+            <w:pPr>
+              <w:jc w:val="right"/>
+              <w:rPr>
+                <w:sz w:val="16"/>
+                <w:szCs w:val="16"/>
+                <w:lang w:val="en-US"/>
+              </w:rPr>
+            </w:pPr>
+            <w:r>
+              <w:rPr>
+                <w:sz w:val="16"/>
+                <w:szCs w:val="16"/>
+                <w:lang w:val="en-US"/>
+              </w:rPr>
+              <w:t>-6.265</w:t>
             </w:r>
           </w:p>
         </w:tc>
@@ -20301,7 +20452,7 @@
               <w:top w:val="nil"/>
               <w:bottom w:val="nil"/>
             </w:tcBorders>
-            <w:shd w:val="clear" w:color="auto" w:fill="E7E6E6" w:themeFill="background2"/>
+            <w:shd w:val="clear" w:color="auto" w:fill="auto"/>
           </w:tcPr>
           <w:p>
             <w:pPr>
@@ -20310,6 +20461,7 @@
                 <w:i/>
                 <w:sz w:val="16"/>
                 <w:szCs w:val="16"/>
+                <w:lang w:val="en-US"/>
               </w:rPr>
             </w:pPr>
             <w:proofErr w:type="spellStart"/>
@@ -20318,6 +20470,7 @@
                 <w:i/>
                 <w:sz w:val="16"/>
                 <w:szCs w:val="16"/>
+                <w:lang w:val="en-US"/>
               </w:rPr>
               <w:t>e</w:t>
             </w:r>
@@ -20327,6 +20480,7 @@
                 <w:sz w:val="16"/>
                 <w:szCs w:val="16"/>
                 <w:vertAlign w:val="subscript"/>
+                <w:lang w:val="en-US"/>
               </w:rPr>
               <w:t>u</w:t>
             </w:r>
@@ -20340,22 +20494,24 @@
               <w:top w:val="nil"/>
               <w:bottom w:val="nil"/>
             </w:tcBorders>
-            <w:shd w:val="clear" w:color="auto" w:fill="E7E6E6" w:themeFill="background2"/>
-          </w:tcPr>
-          <w:p>
-            <w:pPr>
-              <w:jc w:val="right"/>
-              <w:rPr>
-                <w:sz w:val="16"/>
-                <w:szCs w:val="16"/>
-              </w:rPr>
-            </w:pPr>
-            <w:r>
-              <w:rPr>
-                <w:sz w:val="16"/>
-                <w:szCs w:val="16"/>
-              </w:rPr>
-              <w:t>-1.700</w:t>
+            <w:shd w:val="clear" w:color="auto" w:fill="auto"/>
+          </w:tcPr>
+          <w:p>
+            <w:pPr>
+              <w:jc w:val="right"/>
+              <w:rPr>
+                <w:sz w:val="16"/>
+                <w:szCs w:val="16"/>
+                <w:lang w:val="en-US"/>
+              </w:rPr>
+            </w:pPr>
+            <w:r>
+              <w:rPr>
+                <w:sz w:val="16"/>
+                <w:szCs w:val="16"/>
+                <w:lang w:val="en-US"/>
+              </w:rPr>
+              <w:t>-1.745</w:t>
             </w:r>
           </w:p>
         </w:tc>
@@ -20366,24 +20522,35 @@
               <w:top w:val="nil"/>
               <w:bottom w:val="nil"/>
             </w:tcBorders>
-            <w:shd w:val="clear" w:color="auto" w:fill="E7E6E6" w:themeFill="background2"/>
-          </w:tcPr>
-          <w:p>
-            <w:pPr>
-              <w:jc w:val="right"/>
-              <w:rPr>
-                <w:rFonts w:cstheme="minorHAnsi"/>
-                <w:sz w:val="16"/>
-                <w:szCs w:val="16"/>
-              </w:rPr>
-            </w:pPr>
-            <w:r>
-              <w:rPr>
-                <w:rFonts w:cstheme="minorHAnsi"/>
-                <w:sz w:val="16"/>
-                <w:szCs w:val="16"/>
-              </w:rPr>
-              <w:t>78.5%</w:t>
+            <w:shd w:val="clear" w:color="auto" w:fill="auto"/>
+          </w:tcPr>
+          <w:p>
+            <w:pPr>
+              <w:jc w:val="right"/>
+              <w:rPr>
+                <w:rFonts w:cstheme="minorHAnsi"/>
+                <w:sz w:val="16"/>
+                <w:szCs w:val="16"/>
+                <w:lang w:val="en-US"/>
+              </w:rPr>
+            </w:pPr>
+            <w:r>
+              <w:rPr>
+                <w:rFonts w:cstheme="minorHAnsi"/>
+                <w:sz w:val="16"/>
+                <w:szCs w:val="16"/>
+                <w:lang w:val="en-US"/>
+              </w:rPr>
+              <w:t>80.2</w:t>
+            </w:r>
+            <w:r>
+              <w:rPr>
+                <w:rFonts w:cstheme="minorHAnsi"/>
+                <w:sz w:val="16"/>
+                <w:szCs w:val="16"/>
+                <w:lang w:val="en-US"/>
+              </w:rPr>
+              <w:t>%</w:t>
             </w:r>
           </w:p>
         </w:tc>
@@ -20417,33 +20584,40 @@
               <w:top w:val="nil"/>
               <w:bottom w:val="nil"/>
             </w:tcBorders>
-          </w:tcPr>
-          <w:p>
-            <w:pPr>
-              <w:jc w:val="right"/>
-              <w:rPr>
-                <w:rFonts w:cstheme="minorHAnsi"/>
+            <w:shd w:val="clear" w:color="auto" w:fill="auto"/>
+          </w:tcPr>
+          <w:p>
+            <w:pPr>
+              <w:jc w:val="right"/>
+              <w:rPr>
+                <w:rFonts w:cstheme="minorHAnsi"/>
+                <w:b/>
                 <w:i/>
                 <w:sz w:val="16"/>
                 <w:szCs w:val="16"/>
-              </w:rPr>
-            </w:pPr>
-            <w:r>
-              <w:rPr>
-                <w:rFonts w:cstheme="minorHAnsi"/>
+                <w:lang w:val="en-US"/>
+              </w:rPr>
+            </w:pPr>
+            <w:r>
+              <w:rPr>
+                <w:rFonts w:cstheme="minorHAnsi"/>
+                <w:b/>
                 <w:i/>
                 <w:sz w:val="16"/>
                 <w:szCs w:val="16"/>
+                <w:lang w:val="en-US"/>
               </w:rPr>
               <w:t>E</w:t>
             </w:r>
             <w:r>
               <w:rPr>
                 <w:rFonts w:cstheme="minorHAnsi"/>
+                <w:b/>
                 <w:i/>
                 <w:sz w:val="16"/>
                 <w:szCs w:val="16"/>
                 <w:vertAlign w:val="subscript"/>
+                <w:lang w:val="en-US"/>
               </w:rPr>
               <w:t>U</w:t>
             </w:r>
@@ -20457,21 +20631,43 @@
               <w:top w:val="nil"/>
               <w:bottom w:val="nil"/>
             </w:tcBorders>
-          </w:tcPr>
-          <w:p>
-            <w:pPr>
-              <w:jc w:val="right"/>
-              <w:rPr>
-                <w:sz w:val="16"/>
-                <w:szCs w:val="16"/>
-              </w:rPr>
-            </w:pPr>
-            <w:r>
-              <w:rPr>
-                <w:sz w:val="16"/>
-                <w:szCs w:val="16"/>
-              </w:rPr>
-              <w:t>1.900</w:t>
+            <w:shd w:val="clear" w:color="auto" w:fill="auto"/>
+          </w:tcPr>
+          <w:p>
+            <w:pPr>
+              <w:jc w:val="right"/>
+              <w:rPr>
+                <w:b/>
+                <w:sz w:val="16"/>
+                <w:szCs w:val="16"/>
+                <w:lang w:val="en-US"/>
+              </w:rPr>
+            </w:pPr>
+            <w:r>
+              <w:rPr>
+                <w:b/>
+                <w:sz w:val="16"/>
+                <w:szCs w:val="16"/>
+                <w:lang w:val="en-US"/>
+              </w:rPr>
+              <w:t>1</w:t>
+            </w:r>
+            <w:r>
+              <w:rPr>
+                <w:b/>
+                <w:sz w:val="16"/>
+                <w:szCs w:val="16"/>
+              </w:rPr>
+              <w:t>.9</w:t>
+            </w:r>
+            <w:r>
+              <w:rPr>
+                <w:b/>
+                <w:sz w:val="16"/>
+                <w:szCs w:val="16"/>
+                <w:lang w:val="en-US"/>
+              </w:rPr>
+              <w:t>28</w:t>
             </w:r>
           </w:p>
         </w:tc>
@@ -20482,6 +20678,7 @@
               <w:top w:val="nil"/>
               <w:bottom w:val="nil"/>
             </w:tcBorders>
+            <w:shd w:val="clear" w:color="auto" w:fill="auto"/>
           </w:tcPr>
           <w:p>
             <w:pPr>
@@ -20518,21 +20715,22 @@
               <w:top w:val="nil"/>
               <w:bottom w:val="nil"/>
             </w:tcBorders>
-          </w:tcPr>
-          <w:p>
-            <w:pPr>
-              <w:jc w:val="right"/>
-              <w:rPr>
-                <w:sz w:val="16"/>
-                <w:szCs w:val="16"/>
-              </w:rPr>
-            </w:pPr>
-            <w:r>
-              <w:rPr>
-                <w:sz w:val="16"/>
-                <w:szCs w:val="16"/>
-              </w:rPr>
-              <w:t>-6.617</w:t>
+            <w:shd w:val="clear" w:color="auto" w:fill="auto"/>
+          </w:tcPr>
+          <w:p>
+            <w:pPr>
+              <w:jc w:val="right"/>
+              <w:rPr>
+                <w:sz w:val="16"/>
+                <w:szCs w:val="16"/>
+              </w:rPr>
+            </w:pPr>
+            <w:r>
+              <w:rPr>
+                <w:sz w:val="16"/>
+                <w:szCs w:val="16"/>
+              </w:rPr>
+              <w:t>-6.602</w:t>
             </w:r>
           </w:p>
         </w:tc>
@@ -20543,6 +20741,7 @@
               <w:top w:val="nil"/>
               <w:bottom w:val="nil"/>
             </w:tcBorders>
+            <w:shd w:val="clear" w:color="auto" w:fill="auto"/>
           </w:tcPr>
           <w:p>
             <w:pPr>
@@ -20581,21 +20780,22 @@
               <w:top w:val="nil"/>
               <w:bottom w:val="nil"/>
             </w:tcBorders>
-          </w:tcPr>
-          <w:p>
-            <w:pPr>
-              <w:jc w:val="right"/>
-              <w:rPr>
-                <w:sz w:val="16"/>
-                <w:szCs w:val="16"/>
-              </w:rPr>
-            </w:pPr>
-            <w:r>
-              <w:rPr>
-                <w:sz w:val="16"/>
-                <w:szCs w:val="16"/>
-              </w:rPr>
-              <w:t>-1.700</w:t>
+            <w:shd w:val="clear" w:color="auto" w:fill="auto"/>
+          </w:tcPr>
+          <w:p>
+            <w:pPr>
+              <w:jc w:val="right"/>
+              <w:rPr>
+                <w:sz w:val="16"/>
+                <w:szCs w:val="16"/>
+              </w:rPr>
+            </w:pPr>
+            <w:r>
+              <w:rPr>
+                <w:sz w:val="16"/>
+                <w:szCs w:val="16"/>
+              </w:rPr>
+              <w:t>-1.745</w:t>
             </w:r>
           </w:p>
         </w:tc>
@@ -20606,23 +20806,41 @@
               <w:top w:val="nil"/>
               <w:bottom w:val="nil"/>
             </w:tcBorders>
-          </w:tcPr>
-          <w:p>
-            <w:pPr>
-              <w:jc w:val="right"/>
-              <w:rPr>
-                <w:rFonts w:cstheme="minorHAnsi"/>
-                <w:sz w:val="16"/>
-                <w:szCs w:val="16"/>
-              </w:rPr>
-            </w:pPr>
-            <w:r>
-              <w:rPr>
-                <w:rFonts w:cstheme="minorHAnsi"/>
-                <w:sz w:val="16"/>
-                <w:szCs w:val="16"/>
-              </w:rPr>
-              <w:t>44.7%</w:t>
+            <w:shd w:val="clear" w:color="auto" w:fill="auto"/>
+          </w:tcPr>
+          <w:p>
+            <w:pPr>
+              <w:jc w:val="right"/>
+              <w:rPr>
+                <w:rFonts w:cstheme="minorHAnsi"/>
+                <w:sz w:val="16"/>
+                <w:szCs w:val="16"/>
+              </w:rPr>
+            </w:pPr>
+            <w:r>
+              <w:rPr>
+                <w:rFonts w:cstheme="minorHAnsi"/>
+                <w:sz w:val="16"/>
+                <w:szCs w:val="16"/>
+              </w:rPr>
+              <w:t>44.</w:t>
+            </w:r>
+            <w:r>
+              <w:rPr>
+                <w:rFonts w:cstheme="minorHAnsi"/>
+                <w:sz w:val="16"/>
+                <w:szCs w:val="16"/>
+                <w:lang w:val="en-US"/>
+              </w:rPr>
+              <w:t>3</w:t>
+            </w:r>
+            <w:r>
+              <w:rPr>
+                <w:rFonts w:cstheme="minorHAnsi"/>
+                <w:sz w:val="16"/>
+                <w:szCs w:val="16"/>
+              </w:rPr>
+              <w:t>%</w:t>
             </w:r>
           </w:p>
         </w:tc>
@@ -20655,6 +20873,7 @@
               <w:top w:val="nil"/>
               <w:bottom w:val="single" w:sz="4" w:space="0" w:color="auto"/>
             </w:tcBorders>
+            <w:shd w:val="clear" w:color="auto" w:fill="auto"/>
           </w:tcPr>
           <w:p>
             <w:pPr>
@@ -20676,6 +20895,7 @@
               <w:top w:val="nil"/>
               <w:bottom w:val="single" w:sz="4" w:space="0" w:color="auto"/>
             </w:tcBorders>
+            <w:shd w:val="clear" w:color="auto" w:fill="auto"/>
           </w:tcPr>
           <w:p>
             <w:pPr>
@@ -20694,6 +20914,7 @@
               <w:top w:val="nil"/>
               <w:bottom w:val="single" w:sz="4" w:space="0" w:color="auto"/>
             </w:tcBorders>
+            <w:shd w:val="clear" w:color="auto" w:fill="auto"/>
           </w:tcPr>
           <w:p>
             <w:pPr>
@@ -20730,21 +20951,22 @@
               <w:top w:val="nil"/>
               <w:bottom w:val="single" w:sz="4" w:space="0" w:color="auto"/>
             </w:tcBorders>
-          </w:tcPr>
-          <w:p>
-            <w:pPr>
-              <w:jc w:val="right"/>
-              <w:rPr>
-                <w:sz w:val="16"/>
-                <w:szCs w:val="16"/>
-              </w:rPr>
-            </w:pPr>
-            <w:r>
-              <w:rPr>
-                <w:sz w:val="16"/>
-                <w:szCs w:val="16"/>
-              </w:rPr>
-              <w:t>-6.275</w:t>
+            <w:shd w:val="clear" w:color="auto" w:fill="auto"/>
+          </w:tcPr>
+          <w:p>
+            <w:pPr>
+              <w:jc w:val="right"/>
+              <w:rPr>
+                <w:sz w:val="16"/>
+                <w:szCs w:val="16"/>
+              </w:rPr>
+            </w:pPr>
+            <w:r>
+              <w:rPr>
+                <w:sz w:val="16"/>
+                <w:szCs w:val="16"/>
+              </w:rPr>
+              <w:t>-6.265</w:t>
             </w:r>
           </w:p>
         </w:tc>
@@ -20755,6 +20977,7 @@
               <w:top w:val="nil"/>
               <w:bottom w:val="single" w:sz="4" w:space="0" w:color="auto"/>
             </w:tcBorders>
+            <w:shd w:val="clear" w:color="auto" w:fill="auto"/>
           </w:tcPr>
           <w:p>
             <w:pPr>
@@ -20793,21 +21016,22 @@
               <w:top w:val="nil"/>
               <w:bottom w:val="single" w:sz="4" w:space="0" w:color="auto"/>
             </w:tcBorders>
-          </w:tcPr>
-          <w:p>
-            <w:pPr>
-              <w:jc w:val="right"/>
-              <w:rPr>
-                <w:sz w:val="16"/>
-                <w:szCs w:val="16"/>
-              </w:rPr>
-            </w:pPr>
-            <w:r>
-              <w:rPr>
-                <w:sz w:val="16"/>
-                <w:szCs w:val="16"/>
-              </w:rPr>
-              <w:t>-1.383</w:t>
+            <w:shd w:val="clear" w:color="auto" w:fill="auto"/>
+          </w:tcPr>
+          <w:p>
+            <w:pPr>
+              <w:jc w:val="right"/>
+              <w:rPr>
+                <w:sz w:val="16"/>
+                <w:szCs w:val="16"/>
+              </w:rPr>
+            </w:pPr>
+            <w:r>
+              <w:rPr>
+                <w:sz w:val="16"/>
+                <w:szCs w:val="16"/>
+              </w:rPr>
+              <w:t>-1.436</w:t>
             </w:r>
           </w:p>
         </w:tc>
@@ -20818,23 +21042,32 @@
               <w:top w:val="nil"/>
               <w:bottom w:val="single" w:sz="4" w:space="0" w:color="auto"/>
             </w:tcBorders>
-          </w:tcPr>
-          <w:p>
-            <w:pPr>
-              <w:jc w:val="right"/>
-              <w:rPr>
-                <w:rFonts w:cstheme="minorHAnsi"/>
-                <w:sz w:val="16"/>
-                <w:szCs w:val="16"/>
-              </w:rPr>
-            </w:pPr>
-            <w:r>
-              <w:rPr>
-                <w:rFonts w:cstheme="minorHAnsi"/>
-                <w:sz w:val="16"/>
-                <w:szCs w:val="16"/>
-              </w:rPr>
-              <w:t>46.8%</w:t>
+            <w:shd w:val="clear" w:color="auto" w:fill="auto"/>
+          </w:tcPr>
+          <w:p>
+            <w:pPr>
+              <w:jc w:val="right"/>
+              <w:rPr>
+                <w:rFonts w:cstheme="minorHAnsi"/>
+                <w:sz w:val="16"/>
+                <w:szCs w:val="16"/>
+              </w:rPr>
+            </w:pPr>
+            <w:r>
+              <w:rPr>
+                <w:rFonts w:cstheme="minorHAnsi"/>
+                <w:sz w:val="16"/>
+                <w:szCs w:val="16"/>
+              </w:rPr>
+              <w:t>47.0</w:t>
+            </w:r>
+            <w:r>
+              <w:rPr>
+                <w:rFonts w:cstheme="minorHAnsi"/>
+                <w:sz w:val="16"/>
+                <w:szCs w:val="16"/>
+              </w:rPr>
+              <w:t>%</w:t>
             </w:r>
           </w:p>
         </w:tc>
@@ -20859,6 +21092,7 @@
                 <w:rFonts w:cstheme="minorHAnsi"/>
                 <w:sz w:val="16"/>
                 <w:szCs w:val="16"/>
+                <w:highlight w:val="green"/>
               </w:rPr>
               <w:t>5.0</w:t>
             </w:r>
@@ -20871,7 +21105,7 @@
             <w:tcBorders>
               <w:bottom w:val="nil"/>
             </w:tcBorders>
-            <w:shd w:val="clear" w:color="auto" w:fill="E7E6E6" w:themeFill="background2"/>
+            <w:shd w:val="clear" w:color="auto" w:fill="auto"/>
           </w:tcPr>
           <w:p>
             <w:pPr>
@@ -20911,23 +21145,23 @@
             <w:tcBorders>
               <w:bottom w:val="nil"/>
             </w:tcBorders>
-            <w:shd w:val="clear" w:color="auto" w:fill="E7E6E6" w:themeFill="background2"/>
-          </w:tcPr>
-          <w:p>
-            <w:pPr>
-              <w:jc w:val="right"/>
-              <w:rPr>
-                <w:sz w:val="16"/>
-                <w:szCs w:val="16"/>
-              </w:rPr>
-            </w:pPr>
-            <w:r>
-              <w:rPr>
-                <w:rFonts w:cstheme="minorHAnsi"/>
-                <w:sz w:val="16"/>
-                <w:szCs w:val="16"/>
-              </w:rPr>
-              <w:t>1.691</w:t>
+            <w:shd w:val="clear" w:color="auto" w:fill="auto"/>
+          </w:tcPr>
+          <w:p>
+            <w:pPr>
+              <w:jc w:val="right"/>
+              <w:rPr>
+                <w:sz w:val="16"/>
+                <w:szCs w:val="16"/>
+              </w:rPr>
+            </w:pPr>
+            <w:r>
+              <w:rPr>
+                <w:rFonts w:cstheme="minorHAnsi"/>
+                <w:sz w:val="16"/>
+                <w:szCs w:val="16"/>
+              </w:rPr>
+              <w:t>1.729</w:t>
             </w:r>
           </w:p>
         </w:tc>
@@ -20937,7 +21171,7 @@
             <w:tcBorders>
               <w:bottom w:val="nil"/>
             </w:tcBorders>
-            <w:shd w:val="clear" w:color="auto" w:fill="E7E6E6" w:themeFill="background2"/>
+            <w:shd w:val="clear" w:color="auto" w:fill="auto"/>
           </w:tcPr>
           <w:p>
             <w:pPr>
@@ -20973,22 +21207,22 @@
             <w:tcBorders>
               <w:bottom w:val="nil"/>
             </w:tcBorders>
-            <w:shd w:val="clear" w:color="auto" w:fill="E7E6E6" w:themeFill="background2"/>
-          </w:tcPr>
-          <w:p>
-            <w:pPr>
-              <w:jc w:val="right"/>
-              <w:rPr>
-                <w:sz w:val="16"/>
-                <w:szCs w:val="16"/>
-              </w:rPr>
-            </w:pPr>
-            <w:r>
-              <w:rPr>
-                <w:sz w:val="16"/>
-                <w:szCs w:val="16"/>
-              </w:rPr>
-              <w:t>-6.503</w:t>
+            <w:shd w:val="clear" w:color="auto" w:fill="auto"/>
+          </w:tcPr>
+          <w:p>
+            <w:pPr>
+              <w:jc w:val="right"/>
+              <w:rPr>
+                <w:sz w:val="16"/>
+                <w:szCs w:val="16"/>
+              </w:rPr>
+            </w:pPr>
+            <w:r>
+              <w:rPr>
+                <w:sz w:val="16"/>
+                <w:szCs w:val="16"/>
+              </w:rPr>
+              <w:t>-6.489</w:t>
             </w:r>
           </w:p>
         </w:tc>
@@ -20998,7 +21232,7 @@
             <w:tcBorders>
               <w:bottom w:val="nil"/>
             </w:tcBorders>
-            <w:shd w:val="clear" w:color="auto" w:fill="E7E6E6" w:themeFill="background2"/>
+            <w:shd w:val="clear" w:color="auto" w:fill="auto"/>
           </w:tcPr>
           <w:p>
             <w:pPr>
@@ -21036,7 +21270,7 @@
             <w:tcBorders>
               <w:bottom w:val="nil"/>
             </w:tcBorders>
-            <w:shd w:val="clear" w:color="auto" w:fill="E7E6E6" w:themeFill="background2"/>
+            <w:shd w:val="clear" w:color="auto" w:fill="auto"/>
           </w:tcPr>
           <w:p>
             <w:pPr>
@@ -21052,7 +21286,7 @@
                 <w:sz w:val="16"/>
                 <w:szCs w:val="16"/>
               </w:rPr>
-              <w:t>-1.530</w:t>
+              <w:t>-1.579</w:t>
             </w:r>
           </w:p>
         </w:tc>
@@ -21062,24 +21296,40 @@
             <w:tcBorders>
               <w:bottom w:val="nil"/>
             </w:tcBorders>
-            <w:shd w:val="clear" w:color="auto" w:fill="E7E6E6" w:themeFill="background2"/>
-          </w:tcPr>
-          <w:p>
-            <w:pPr>
-              <w:jc w:val="right"/>
-              <w:rPr>
-                <w:rFonts w:cstheme="minorHAnsi"/>
-                <w:sz w:val="16"/>
-                <w:szCs w:val="16"/>
-              </w:rPr>
-            </w:pPr>
-            <w:r>
-              <w:rPr>
-                <w:rFonts w:cstheme="minorHAnsi"/>
-                <w:sz w:val="16"/>
-                <w:szCs w:val="16"/>
-              </w:rPr>
-              <w:t>41.7%</w:t>
+            <w:shd w:val="clear" w:color="auto" w:fill="auto"/>
+          </w:tcPr>
+          <w:p>
+            <w:pPr>
+              <w:jc w:val="right"/>
+              <w:rPr>
+                <w:rFonts w:cstheme="minorHAnsi"/>
+                <w:sz w:val="16"/>
+                <w:szCs w:val="16"/>
+              </w:rPr>
+            </w:pPr>
+            <w:r>
+              <w:rPr>
+                <w:rFonts w:cstheme="minorHAnsi"/>
+                <w:sz w:val="16"/>
+                <w:szCs w:val="16"/>
+              </w:rPr>
+              <w:t>41.</w:t>
+            </w:r>
+            <w:r>
+              <w:rPr>
+                <w:rFonts w:cstheme="minorHAnsi"/>
+                <w:sz w:val="16"/>
+                <w:szCs w:val="16"/>
+              </w:rPr>
+              <w:t>1</w:t>
+            </w:r>
+            <w:r>
+              <w:rPr>
+                <w:rFonts w:cstheme="minorHAnsi"/>
+                <w:sz w:val="16"/>
+                <w:szCs w:val="16"/>
+              </w:rPr>
+              <w:t>%</w:t>
             </w:r>
           </w:p>
         </w:tc>
@@ -21109,7 +21359,7 @@
               <w:top w:val="nil"/>
               <w:bottom w:val="nil"/>
             </w:tcBorders>
-            <w:shd w:val="clear" w:color="auto" w:fill="E7E6E6" w:themeFill="background2"/>
+            <w:shd w:val="clear" w:color="auto" w:fill="auto"/>
           </w:tcPr>
           <w:p>
             <w:pPr>
@@ -21131,7 +21381,7 @@
               <w:top w:val="nil"/>
               <w:bottom w:val="nil"/>
             </w:tcBorders>
-            <w:shd w:val="clear" w:color="auto" w:fill="E7E6E6" w:themeFill="background2"/>
+            <w:shd w:val="clear" w:color="auto" w:fill="auto"/>
           </w:tcPr>
           <w:p>
             <w:pPr>
@@ -21150,7 +21400,7 @@
               <w:top w:val="nil"/>
               <w:bottom w:val="nil"/>
             </w:tcBorders>
-            <w:shd w:val="clear" w:color="auto" w:fill="E7E6E6" w:themeFill="background2"/>
+            <w:shd w:val="clear" w:color="auto" w:fill="auto"/>
           </w:tcPr>
           <w:p>
             <w:pPr>
@@ -21187,22 +21437,22 @@
               <w:top w:val="nil"/>
               <w:bottom w:val="nil"/>
             </w:tcBorders>
-            <w:shd w:val="clear" w:color="auto" w:fill="E7E6E6" w:themeFill="background2"/>
-          </w:tcPr>
-          <w:p>
-            <w:pPr>
-              <w:jc w:val="right"/>
-              <w:rPr>
-                <w:sz w:val="16"/>
-                <w:szCs w:val="16"/>
-              </w:rPr>
-            </w:pPr>
-            <w:r>
-              <w:rPr>
-                <w:sz w:val="16"/>
-                <w:szCs w:val="16"/>
-              </w:rPr>
-              <w:t>-6.434</w:t>
+            <w:shd w:val="clear" w:color="auto" w:fill="auto"/>
+          </w:tcPr>
+          <w:p>
+            <w:pPr>
+              <w:jc w:val="right"/>
+              <w:rPr>
+                <w:sz w:val="16"/>
+                <w:szCs w:val="16"/>
+              </w:rPr>
+            </w:pPr>
+            <w:r>
+              <w:rPr>
+                <w:sz w:val="16"/>
+                <w:szCs w:val="16"/>
+              </w:rPr>
+              <w:t>-6.422</w:t>
             </w:r>
           </w:p>
         </w:tc>
@@ -21213,7 +21463,7 @@
               <w:top w:val="nil"/>
               <w:bottom w:val="nil"/>
             </w:tcBorders>
-            <w:shd w:val="clear" w:color="auto" w:fill="E7E6E6" w:themeFill="background2"/>
+            <w:shd w:val="clear" w:color="auto" w:fill="auto"/>
           </w:tcPr>
           <w:p>
             <w:pPr>
@@ -21252,22 +21502,22 @@
               <w:top w:val="nil"/>
               <w:bottom w:val="nil"/>
             </w:tcBorders>
-            <w:shd w:val="clear" w:color="auto" w:fill="E7E6E6" w:themeFill="background2"/>
-          </w:tcPr>
-          <w:p>
-            <w:pPr>
-              <w:jc w:val="right"/>
-              <w:rPr>
-                <w:sz w:val="16"/>
-                <w:szCs w:val="16"/>
-              </w:rPr>
-            </w:pPr>
-            <w:r>
-              <w:rPr>
-                <w:sz w:val="16"/>
-                <w:szCs w:val="16"/>
-              </w:rPr>
-              <w:t>-1.596</w:t>
+            <w:shd w:val="clear" w:color="auto" w:fill="auto"/>
+          </w:tcPr>
+          <w:p>
+            <w:pPr>
+              <w:jc w:val="right"/>
+              <w:rPr>
+                <w:sz w:val="16"/>
+                <w:szCs w:val="16"/>
+              </w:rPr>
+            </w:pPr>
+            <w:r>
+              <w:rPr>
+                <w:sz w:val="16"/>
+                <w:szCs w:val="16"/>
+              </w:rPr>
+              <w:t>-1.643</w:t>
             </w:r>
           </w:p>
         </w:tc>
@@ -21278,24 +21528,40 @@
               <w:top w:val="nil"/>
               <w:bottom w:val="nil"/>
             </w:tcBorders>
-            <w:shd w:val="clear" w:color="auto" w:fill="E7E6E6" w:themeFill="background2"/>
-          </w:tcPr>
-          <w:p>
-            <w:pPr>
-              <w:jc w:val="right"/>
-              <w:rPr>
-                <w:rFonts w:cstheme="minorHAnsi"/>
-                <w:sz w:val="16"/>
-                <w:szCs w:val="16"/>
-              </w:rPr>
-            </w:pPr>
-            <w:r>
-              <w:rPr>
-                <w:rFonts w:cstheme="minorHAnsi"/>
-                <w:sz w:val="16"/>
-                <w:szCs w:val="16"/>
-              </w:rPr>
-              <w:t>53.6%</w:t>
+            <w:shd w:val="clear" w:color="auto" w:fill="auto"/>
+          </w:tcPr>
+          <w:p>
+            <w:pPr>
+              <w:jc w:val="right"/>
+              <w:rPr>
+                <w:rFonts w:cstheme="minorHAnsi"/>
+                <w:sz w:val="16"/>
+                <w:szCs w:val="16"/>
+              </w:rPr>
+            </w:pPr>
+            <w:r>
+              <w:rPr>
+                <w:rFonts w:cstheme="minorHAnsi"/>
+                <w:sz w:val="16"/>
+                <w:szCs w:val="16"/>
+              </w:rPr>
+              <w:t>53.</w:t>
+            </w:r>
+            <w:r>
+              <w:rPr>
+                <w:rFonts w:cstheme="minorHAnsi"/>
+                <w:sz w:val="16"/>
+                <w:szCs w:val="16"/>
+              </w:rPr>
+              <w:t>9</w:t>
+            </w:r>
+            <w:r>
+              <w:rPr>
+                <w:rFonts w:cstheme="minorHAnsi"/>
+                <w:sz w:val="16"/>
+                <w:szCs w:val="16"/>
+              </w:rPr>
+              <w:t>%</w:t>
             </w:r>
           </w:p>
         </w:tc>
@@ -21325,12 +21591,14 @@
               <w:top w:val="nil"/>
               <w:bottom w:val="nil"/>
             </w:tcBorders>
-          </w:tcPr>
-          <w:p>
-            <w:pPr>
-              <w:jc w:val="right"/>
-              <w:rPr>
-                <w:rFonts w:cstheme="minorHAnsi"/>
+            <w:shd w:val="clear" w:color="auto" w:fill="auto"/>
+          </w:tcPr>
+          <w:p>
+            <w:pPr>
+              <w:jc w:val="right"/>
+              <w:rPr>
+                <w:rFonts w:cstheme="minorHAnsi"/>
+                <w:b/>
                 <w:i/>
                 <w:sz w:val="16"/>
                 <w:szCs w:val="16"/>
@@ -21339,6 +21607,7 @@
             <w:r>
               <w:rPr>
                 <w:rFonts w:cstheme="minorHAnsi"/>
+                <w:b/>
                 <w:i/>
                 <w:sz w:val="16"/>
                 <w:szCs w:val="16"/>
@@ -21348,6 +21617,7 @@
             <w:r>
               <w:rPr>
                 <w:rFonts w:cstheme="minorHAnsi"/>
+                <w:b/>
                 <w:i/>
                 <w:sz w:val="16"/>
                 <w:szCs w:val="16"/>
@@ -21365,22 +21635,25 @@
               <w:top w:val="nil"/>
               <w:bottom w:val="nil"/>
             </w:tcBorders>
-          </w:tcPr>
-          <w:p>
-            <w:pPr>
-              <w:jc w:val="right"/>
-              <w:rPr>
-                <w:sz w:val="16"/>
-                <w:szCs w:val="16"/>
-              </w:rPr>
-            </w:pPr>
-            <w:r>
-              <w:rPr>
-                <w:rFonts w:cstheme="minorHAnsi"/>
-                <w:sz w:val="16"/>
-                <w:szCs w:val="16"/>
-              </w:rPr>
-              <w:t>1.881</w:t>
+            <w:shd w:val="clear" w:color="auto" w:fill="auto"/>
+          </w:tcPr>
+          <w:p>
+            <w:pPr>
+              <w:jc w:val="right"/>
+              <w:rPr>
+                <w:b/>
+                <w:sz w:val="16"/>
+                <w:szCs w:val="16"/>
+              </w:rPr>
+            </w:pPr>
+            <w:r>
+              <w:rPr>
+                <w:rFonts w:cstheme="minorHAnsi"/>
+                <w:b/>
+                <w:sz w:val="16"/>
+                <w:szCs w:val="16"/>
+              </w:rPr>
+              <w:t>1.910</w:t>
             </w:r>
           </w:p>
         </w:tc>
@@ -21391,6 +21664,7 @@
               <w:top w:val="nil"/>
               <w:bottom w:val="nil"/>
             </w:tcBorders>
+            <w:shd w:val="clear" w:color="auto" w:fill="auto"/>
           </w:tcPr>
           <w:p>
             <w:pPr>
@@ -21427,21 +21701,22 @@
               <w:top w:val="nil"/>
               <w:bottom w:val="nil"/>
             </w:tcBorders>
-          </w:tcPr>
-          <w:p>
-            <w:pPr>
-              <w:jc w:val="right"/>
-              <w:rPr>
-                <w:sz w:val="16"/>
-                <w:szCs w:val="16"/>
-              </w:rPr>
-            </w:pPr>
-            <w:r>
-              <w:rPr>
-                <w:sz w:val="16"/>
-                <w:szCs w:val="16"/>
-              </w:rPr>
-              <w:t>-6.503</w:t>
+            <w:shd w:val="clear" w:color="auto" w:fill="auto"/>
+          </w:tcPr>
+          <w:p>
+            <w:pPr>
+              <w:jc w:val="right"/>
+              <w:rPr>
+                <w:sz w:val="16"/>
+                <w:szCs w:val="16"/>
+              </w:rPr>
+            </w:pPr>
+            <w:r>
+              <w:rPr>
+                <w:sz w:val="16"/>
+                <w:szCs w:val="16"/>
+              </w:rPr>
+              <w:t>-6.489</w:t>
             </w:r>
           </w:p>
         </w:tc>
@@ -21452,6 +21727,7 @@
               <w:top w:val="nil"/>
               <w:bottom w:val="nil"/>
             </w:tcBorders>
+            <w:shd w:val="clear" w:color="auto" w:fill="auto"/>
           </w:tcPr>
           <w:p>
             <w:pPr>
@@ -21490,21 +21766,22 @@
               <w:top w:val="nil"/>
               <w:bottom w:val="nil"/>
             </w:tcBorders>
-          </w:tcPr>
-          <w:p>
-            <w:pPr>
-              <w:jc w:val="right"/>
-              <w:rPr>
-                <w:sz w:val="16"/>
-                <w:szCs w:val="16"/>
-              </w:rPr>
-            </w:pPr>
-            <w:r>
-              <w:rPr>
-                <w:sz w:val="16"/>
-                <w:szCs w:val="16"/>
-              </w:rPr>
-              <w:t>-1.596</w:t>
+            <w:shd w:val="clear" w:color="auto" w:fill="auto"/>
+          </w:tcPr>
+          <w:p>
+            <w:pPr>
+              <w:jc w:val="right"/>
+              <w:rPr>
+                <w:sz w:val="16"/>
+                <w:szCs w:val="16"/>
+              </w:rPr>
+            </w:pPr>
+            <w:r>
+              <w:rPr>
+                <w:sz w:val="16"/>
+                <w:szCs w:val="16"/>
+              </w:rPr>
+              <w:t>-1.643</w:t>
             </w:r>
           </w:p>
         </w:tc>
@@ -21515,23 +21792,40 @@
               <w:top w:val="nil"/>
               <w:bottom w:val="nil"/>
             </w:tcBorders>
-          </w:tcPr>
-          <w:p>
-            <w:pPr>
-              <w:jc w:val="right"/>
-              <w:rPr>
-                <w:rFonts w:cstheme="minorHAnsi"/>
-                <w:sz w:val="16"/>
-                <w:szCs w:val="16"/>
-              </w:rPr>
-            </w:pPr>
-            <w:r>
-              <w:rPr>
-                <w:rFonts w:cstheme="minorHAnsi"/>
-                <w:sz w:val="16"/>
-                <w:szCs w:val="16"/>
-              </w:rPr>
-              <w:t>45.9%</w:t>
+            <w:shd w:val="clear" w:color="auto" w:fill="auto"/>
+          </w:tcPr>
+          <w:p>
+            <w:pPr>
+              <w:jc w:val="right"/>
+              <w:rPr>
+                <w:rFonts w:cstheme="minorHAnsi"/>
+                <w:sz w:val="16"/>
+                <w:szCs w:val="16"/>
+              </w:rPr>
+            </w:pPr>
+            <w:r>
+              <w:rPr>
+                <w:rFonts w:cstheme="minorHAnsi"/>
+                <w:sz w:val="16"/>
+                <w:szCs w:val="16"/>
+              </w:rPr>
+              <w:t>45.</w:t>
+            </w:r>
+            <w:r>
+              <w:rPr>
+                <w:rFonts w:cstheme="minorHAnsi"/>
+                <w:sz w:val="16"/>
+                <w:szCs w:val="16"/>
+              </w:rPr>
+              <w:t>8</w:t>
+            </w:r>
+            <w:r>
+              <w:rPr>
+                <w:rFonts w:cstheme="minorHAnsi"/>
+                <w:sz w:val="16"/>
+                <w:szCs w:val="16"/>
+              </w:rPr>
+              <w:t>%</w:t>
             </w:r>
           </w:p>
         </w:tc>
@@ -21561,6 +21855,7 @@
               <w:top w:val="nil"/>
               <w:bottom w:val="single" w:sz="4" w:space="0" w:color="auto"/>
             </w:tcBorders>
+            <w:shd w:val="clear" w:color="auto" w:fill="auto"/>
           </w:tcPr>
           <w:p>
             <w:pPr>
@@ -21582,6 +21877,7 @@
               <w:top w:val="nil"/>
               <w:bottom w:val="single" w:sz="4" w:space="0" w:color="auto"/>
             </w:tcBorders>
+            <w:shd w:val="clear" w:color="auto" w:fill="auto"/>
           </w:tcPr>
           <w:p>
             <w:pPr>
@@ -21600,6 +21896,7 @@
               <w:top w:val="nil"/>
               <w:bottom w:val="single" w:sz="4" w:space="0" w:color="auto"/>
             </w:tcBorders>
+            <w:shd w:val="clear" w:color="auto" w:fill="auto"/>
           </w:tcPr>
           <w:p>
             <w:pPr>
@@ -21636,21 +21933,22 @@
               <w:top w:val="nil"/>
               <w:bottom w:val="single" w:sz="4" w:space="0" w:color="auto"/>
             </w:tcBorders>
-          </w:tcPr>
-          <w:p>
-            <w:pPr>
-              <w:jc w:val="right"/>
-              <w:rPr>
-                <w:sz w:val="16"/>
-                <w:szCs w:val="16"/>
-              </w:rPr>
-            </w:pPr>
-            <w:r>
-              <w:rPr>
-                <w:sz w:val="16"/>
-                <w:szCs w:val="16"/>
-              </w:rPr>
-              <w:t>-6.434</w:t>
+            <w:shd w:val="clear" w:color="auto" w:fill="auto"/>
+          </w:tcPr>
+          <w:p>
+            <w:pPr>
+              <w:jc w:val="right"/>
+              <w:rPr>
+                <w:sz w:val="16"/>
+                <w:szCs w:val="16"/>
+              </w:rPr>
+            </w:pPr>
+            <w:r>
+              <w:rPr>
+                <w:sz w:val="16"/>
+                <w:szCs w:val="16"/>
+              </w:rPr>
+              <w:t>-6.422</w:t>
             </w:r>
           </w:p>
         </w:tc>
@@ -21661,6 +21959,7 @@
               <w:top w:val="nil"/>
               <w:bottom w:val="single" w:sz="4" w:space="0" w:color="auto"/>
             </w:tcBorders>
+            <w:shd w:val="clear" w:color="auto" w:fill="auto"/>
           </w:tcPr>
           <w:p>
             <w:pPr>
@@ -21699,21 +21998,22 @@
               <w:top w:val="nil"/>
               <w:bottom w:val="single" w:sz="4" w:space="0" w:color="auto"/>
             </w:tcBorders>
-          </w:tcPr>
-          <w:p>
-            <w:pPr>
-              <w:jc w:val="right"/>
-              <w:rPr>
-                <w:sz w:val="16"/>
-                <w:szCs w:val="16"/>
-              </w:rPr>
-            </w:pPr>
-            <w:r>
-              <w:rPr>
-                <w:sz w:val="16"/>
-                <w:szCs w:val="16"/>
-              </w:rPr>
-              <w:t>-1.530</w:t>
+            <w:shd w:val="clear" w:color="auto" w:fill="auto"/>
+          </w:tcPr>
+          <w:p>
+            <w:pPr>
+              <w:jc w:val="right"/>
+              <w:rPr>
+                <w:sz w:val="16"/>
+                <w:szCs w:val="16"/>
+              </w:rPr>
+            </w:pPr>
+            <w:r>
+              <w:rPr>
+                <w:sz w:val="16"/>
+                <w:szCs w:val="16"/>
+              </w:rPr>
+              <w:t>-1.579</w:t>
             </w:r>
           </w:p>
         </w:tc>
@@ -21724,23 +22024,56 @@
               <w:top w:val="nil"/>
               <w:bottom w:val="single" w:sz="4" w:space="0" w:color="auto"/>
             </w:tcBorders>
-          </w:tcPr>
-          <w:p>
-            <w:pPr>
-              <w:jc w:val="right"/>
-              <w:rPr>
-                <w:rFonts w:cstheme="minorHAnsi"/>
-                <w:sz w:val="16"/>
-                <w:szCs w:val="16"/>
-              </w:rPr>
-            </w:pPr>
-            <w:r>
-              <w:rPr>
-                <w:rFonts w:cstheme="minorHAnsi"/>
-                <w:sz w:val="16"/>
-                <w:szCs w:val="16"/>
-              </w:rPr>
-              <w:t>46.0%</w:t>
+            <w:shd w:val="clear" w:color="auto" w:fill="auto"/>
+          </w:tcPr>
+          <w:p>
+            <w:pPr>
+              <w:jc w:val="right"/>
+              <w:rPr>
+                <w:rFonts w:cstheme="minorHAnsi"/>
+                <w:sz w:val="16"/>
+                <w:szCs w:val="16"/>
+              </w:rPr>
+            </w:pPr>
+            <w:r>
+              <w:rPr>
+                <w:rFonts w:cstheme="minorHAnsi"/>
+                <w:sz w:val="16"/>
+                <w:szCs w:val="16"/>
+              </w:rPr>
+              <w:t>4</w:t>
+            </w:r>
+            <w:r>
+              <w:rPr>
+                <w:rFonts w:cstheme="minorHAnsi"/>
+                <w:sz w:val="16"/>
+                <w:szCs w:val="16"/>
+              </w:rPr>
+              <w:t>5</w:t>
+            </w:r>
+            <w:r>
+              <w:rPr>
+                <w:rFonts w:cstheme="minorHAnsi"/>
+                <w:sz w:val="16"/>
+                <w:szCs w:val="16"/>
+              </w:rPr>
+              <w:t>.</w:t>
+            </w:r>
+            <w:r>
+              <w:rPr>
+                <w:rFonts w:cstheme="minorHAnsi"/>
+                <w:sz w:val="16"/>
+                <w:szCs w:val="16"/>
+              </w:rPr>
+              <w:t>9</w:t>
+            </w:r>
+            <w:r>
+              <w:rPr>
+                <w:rFonts w:cstheme="minorHAnsi"/>
+                <w:sz w:val="16"/>
+                <w:szCs w:val="16"/>
+              </w:rPr>
+              <w:t>%</w:t>
             </w:r>
           </w:p>
         </w:tc>
@@ -21765,9 +22098,12 @@
                 <w:rFonts w:cstheme="minorHAnsi"/>
                 <w:sz w:val="16"/>
                 <w:szCs w:val="16"/>
+                <w:highlight w:val="green"/>
               </w:rPr>
               <w:t>6.0</w:t>
             </w:r>
+            <w:bookmarkStart w:id="0" w:name="_GoBack"/>
+            <w:bookmarkEnd w:id="0"/>
           </w:p>
         </w:tc>
         <w:tc>
@@ -21777,7 +22113,7 @@
             <w:tcBorders>
               <w:bottom w:val="nil"/>
             </w:tcBorders>
-            <w:shd w:val="clear" w:color="auto" w:fill="E7E6E6" w:themeFill="background2"/>
+            <w:shd w:val="clear" w:color="auto" w:fill="auto"/>
           </w:tcPr>
           <w:p>
             <w:pPr>
@@ -21817,22 +22153,29 @@
             <w:tcBorders>
               <w:bottom w:val="nil"/>
             </w:tcBorders>
-            <w:shd w:val="clear" w:color="auto" w:fill="E7E6E6" w:themeFill="background2"/>
-          </w:tcPr>
-          <w:p>
-            <w:pPr>
-              <w:jc w:val="right"/>
-              <w:rPr>
-                <w:sz w:val="16"/>
-                <w:szCs w:val="16"/>
-              </w:rPr>
-            </w:pPr>
-            <w:r>
-              <w:rPr>
-                <w:sz w:val="16"/>
-                <w:szCs w:val="16"/>
-              </w:rPr>
-              <w:t>1.731</w:t>
+            <w:shd w:val="clear" w:color="auto" w:fill="auto"/>
+          </w:tcPr>
+          <w:p>
+            <w:pPr>
+              <w:jc w:val="right"/>
+              <w:rPr>
+                <w:sz w:val="16"/>
+                <w:szCs w:val="16"/>
+              </w:rPr>
+            </w:pPr>
+            <w:r>
+              <w:rPr>
+                <w:sz w:val="16"/>
+                <w:szCs w:val="16"/>
+              </w:rPr>
+              <w:t>1.7</w:t>
+            </w:r>
+            <w:r>
+              <w:rPr>
+                <w:sz w:val="16"/>
+                <w:szCs w:val="16"/>
+              </w:rPr>
+              <w:t>67</w:t>
             </w:r>
           </w:p>
         </w:tc>
@@ -21842,7 +22185,7 @@
             <w:tcBorders>
               <w:bottom w:val="nil"/>
             </w:tcBorders>
-            <w:shd w:val="clear" w:color="auto" w:fill="E7E6E6" w:themeFill="background2"/>
+            <w:shd w:val="clear" w:color="auto" w:fill="auto"/>
           </w:tcPr>
           <w:p>
             <w:pPr>
@@ -21878,22 +22221,22 @@
             <w:tcBorders>
               <w:bottom w:val="nil"/>
             </w:tcBorders>
-            <w:shd w:val="clear" w:color="auto" w:fill="E7E6E6" w:themeFill="background2"/>
-          </w:tcPr>
-          <w:p>
-            <w:pPr>
-              <w:jc w:val="right"/>
-              <w:rPr>
-                <w:sz w:val="16"/>
-                <w:szCs w:val="16"/>
-              </w:rPr>
-            </w:pPr>
-            <w:r>
-              <w:rPr>
-                <w:sz w:val="16"/>
-                <w:szCs w:val="16"/>
-              </w:rPr>
-              <w:t>-6.495</w:t>
+            <w:shd w:val="clear" w:color="auto" w:fill="auto"/>
+          </w:tcPr>
+          <w:p>
+            <w:pPr>
+              <w:jc w:val="right"/>
+              <w:rPr>
+                <w:sz w:val="16"/>
+                <w:szCs w:val="16"/>
+              </w:rPr>
+            </w:pPr>
+            <w:r>
+              <w:rPr>
+                <w:sz w:val="16"/>
+                <w:szCs w:val="16"/>
+              </w:rPr>
+              <w:t>-6.481</w:t>
             </w:r>
           </w:p>
         </w:tc>
@@ -21903,7 +22246,7 @@
             <w:tcBorders>
               <w:bottom w:val="nil"/>
             </w:tcBorders>
-            <w:shd w:val="clear" w:color="auto" w:fill="E7E6E6" w:themeFill="background2"/>
+            <w:shd w:val="clear" w:color="auto" w:fill="auto"/>
           </w:tcPr>
           <w:p>
             <w:pPr>
@@ -21941,22 +22284,22 @@
             <w:tcBorders>
               <w:bottom w:val="nil"/>
             </w:tcBorders>
-            <w:shd w:val="clear" w:color="auto" w:fill="E7E6E6" w:themeFill="background2"/>
-          </w:tcPr>
-          <w:p>
-            <w:pPr>
-              <w:jc w:val="right"/>
-              <w:rPr>
-                <w:sz w:val="16"/>
-                <w:szCs w:val="16"/>
-              </w:rPr>
-            </w:pPr>
-            <w:r>
-              <w:rPr>
-                <w:sz w:val="16"/>
-                <w:szCs w:val="16"/>
-              </w:rPr>
-              <w:t>-1.574</w:t>
+            <w:shd w:val="clear" w:color="auto" w:fill="auto"/>
+          </w:tcPr>
+          <w:p>
+            <w:pPr>
+              <w:jc w:val="right"/>
+              <w:rPr>
+                <w:sz w:val="16"/>
+                <w:szCs w:val="16"/>
+              </w:rPr>
+            </w:pPr>
+            <w:r>
+              <w:rPr>
+                <w:sz w:val="16"/>
+                <w:szCs w:val="16"/>
+              </w:rPr>
+              <w:t>-1.635</w:t>
             </w:r>
           </w:p>
         </w:tc>
@@ -21966,24 +22309,40 @@
             <w:tcBorders>
               <w:bottom w:val="nil"/>
             </w:tcBorders>
-            <w:shd w:val="clear" w:color="auto" w:fill="E7E6E6" w:themeFill="background2"/>
-          </w:tcPr>
-          <w:p>
-            <w:pPr>
-              <w:jc w:val="right"/>
-              <w:rPr>
-                <w:rFonts w:cstheme="minorHAnsi"/>
-                <w:sz w:val="16"/>
-                <w:szCs w:val="16"/>
-              </w:rPr>
-            </w:pPr>
-            <w:r>
-              <w:rPr>
-                <w:rFonts w:cstheme="minorHAnsi"/>
-                <w:sz w:val="16"/>
-                <w:szCs w:val="16"/>
-              </w:rPr>
-              <w:t>46.3%</w:t>
+            <w:shd w:val="clear" w:color="auto" w:fill="auto"/>
+          </w:tcPr>
+          <w:p>
+            <w:pPr>
+              <w:jc w:val="right"/>
+              <w:rPr>
+                <w:rFonts w:cstheme="minorHAnsi"/>
+                <w:sz w:val="16"/>
+                <w:szCs w:val="16"/>
+              </w:rPr>
+            </w:pPr>
+            <w:r>
+              <w:rPr>
+                <w:rFonts w:cstheme="minorHAnsi"/>
+                <w:sz w:val="16"/>
+                <w:szCs w:val="16"/>
+              </w:rPr>
+              <w:t>46.</w:t>
+            </w:r>
+            <w:r>
+              <w:rPr>
+                <w:rFonts w:cstheme="minorHAnsi"/>
+                <w:sz w:val="16"/>
+                <w:szCs w:val="16"/>
+              </w:rPr>
+              <w:t>2</w:t>
+            </w:r>
+            <w:r>
+              <w:rPr>
+                <w:rFonts w:cstheme="minorHAnsi"/>
+                <w:sz w:val="16"/>
+                <w:szCs w:val="16"/>
+              </w:rPr>
+              <w:t>%</w:t>
             </w:r>
           </w:p>
         </w:tc>
@@ -22013,7 +22372,7 @@
               <w:top w:val="nil"/>
               <w:bottom w:val="nil"/>
             </w:tcBorders>
-            <w:shd w:val="clear" w:color="auto" w:fill="E7E6E6" w:themeFill="background2"/>
+            <w:shd w:val="clear" w:color="auto" w:fill="auto"/>
           </w:tcPr>
           <w:p>
             <w:pPr>
@@ -22035,7 +22394,7 @@
               <w:top w:val="nil"/>
               <w:bottom w:val="nil"/>
             </w:tcBorders>
-            <w:shd w:val="clear" w:color="auto" w:fill="E7E6E6" w:themeFill="background2"/>
+            <w:shd w:val="clear" w:color="auto" w:fill="auto"/>
           </w:tcPr>
           <w:p>
             <w:pPr>
@@ -22054,7 +22413,7 @@
               <w:top w:val="nil"/>
               <w:bottom w:val="nil"/>
             </w:tcBorders>
-            <w:shd w:val="clear" w:color="auto" w:fill="E7E6E6" w:themeFill="background2"/>
+            <w:shd w:val="clear" w:color="auto" w:fill="auto"/>
           </w:tcPr>
           <w:p>
             <w:pPr>
@@ -22091,22 +22450,22 @@
               <w:top w:val="nil"/>
               <w:bottom w:val="nil"/>
             </w:tcBorders>
-            <w:shd w:val="clear" w:color="auto" w:fill="E7E6E6" w:themeFill="background2"/>
-          </w:tcPr>
-          <w:p>
-            <w:pPr>
-              <w:jc w:val="right"/>
-              <w:rPr>
-                <w:sz w:val="16"/>
-                <w:szCs w:val="16"/>
-              </w:rPr>
-            </w:pPr>
-            <w:r>
-              <w:rPr>
-                <w:sz w:val="16"/>
-                <w:szCs w:val="16"/>
-              </w:rPr>
-              <w:t>-6.482</w:t>
+            <w:shd w:val="clear" w:color="auto" w:fill="auto"/>
+          </w:tcPr>
+          <w:p>
+            <w:pPr>
+              <w:jc w:val="right"/>
+              <w:rPr>
+                <w:sz w:val="16"/>
+                <w:szCs w:val="16"/>
+              </w:rPr>
+            </w:pPr>
+            <w:r>
+              <w:rPr>
+                <w:sz w:val="16"/>
+                <w:szCs w:val="16"/>
+              </w:rPr>
+              <w:t>-6.468</w:t>
             </w:r>
           </w:p>
         </w:tc>
@@ -22117,7 +22476,7 @@
               <w:top w:val="nil"/>
               <w:bottom w:val="nil"/>
             </w:tcBorders>
-            <w:shd w:val="clear" w:color="auto" w:fill="E7E6E6" w:themeFill="background2"/>
+            <w:shd w:val="clear" w:color="auto" w:fill="auto"/>
           </w:tcPr>
           <w:p>
             <w:pPr>
@@ -22156,22 +22515,22 @@
               <w:top w:val="nil"/>
               <w:bottom w:val="nil"/>
             </w:tcBorders>
-            <w:shd w:val="clear" w:color="auto" w:fill="E7E6E6" w:themeFill="background2"/>
-          </w:tcPr>
-          <w:p>
-            <w:pPr>
-              <w:jc w:val="right"/>
-              <w:rPr>
-                <w:sz w:val="16"/>
-                <w:szCs w:val="16"/>
-              </w:rPr>
-            </w:pPr>
-            <w:r>
-              <w:rPr>
-                <w:sz w:val="16"/>
-                <w:szCs w:val="16"/>
-              </w:rPr>
-              <w:t>-1.588</w:t>
+            <w:shd w:val="clear" w:color="auto" w:fill="auto"/>
+          </w:tcPr>
+          <w:p>
+            <w:pPr>
+              <w:jc w:val="right"/>
+              <w:rPr>
+                <w:sz w:val="16"/>
+                <w:szCs w:val="16"/>
+              </w:rPr>
+            </w:pPr>
+            <w:r>
+              <w:rPr>
+                <w:sz w:val="16"/>
+                <w:szCs w:val="16"/>
+              </w:rPr>
+              <w:t>-1.622</w:t>
             </w:r>
           </w:p>
         </w:tc>
@@ -22182,7 +22541,7 @@
               <w:top w:val="nil"/>
               <w:bottom w:val="nil"/>
             </w:tcBorders>
-            <w:shd w:val="clear" w:color="auto" w:fill="E7E6E6" w:themeFill="background2"/>
+            <w:shd w:val="clear" w:color="auto" w:fill="auto"/>
           </w:tcPr>
           <w:p>
             <w:pPr>
@@ -22229,12 +22588,14 @@
               <w:top w:val="nil"/>
               <w:bottom w:val="nil"/>
             </w:tcBorders>
-          </w:tcPr>
-          <w:p>
-            <w:pPr>
-              <w:jc w:val="right"/>
-              <w:rPr>
-                <w:rFonts w:cstheme="minorHAnsi"/>
+            <w:shd w:val="clear" w:color="auto" w:fill="auto"/>
+          </w:tcPr>
+          <w:p>
+            <w:pPr>
+              <w:jc w:val="right"/>
+              <w:rPr>
+                <w:rFonts w:cstheme="minorHAnsi"/>
+                <w:b/>
                 <w:i/>
                 <w:sz w:val="16"/>
                 <w:szCs w:val="16"/>
@@ -22243,6 +22604,7 @@
             <w:r>
               <w:rPr>
                 <w:rFonts w:cstheme="minorHAnsi"/>
+                <w:b/>
                 <w:i/>
                 <w:sz w:val="16"/>
                 <w:szCs w:val="16"/>
@@ -22252,6 +22614,7 @@
             <w:r>
               <w:rPr>
                 <w:rFonts w:cstheme="minorHAnsi"/>
+                <w:b/>
                 <w:i/>
                 <w:sz w:val="16"/>
                 <w:szCs w:val="16"/>
@@ -22269,21 +22632,40 @@
               <w:top w:val="nil"/>
               <w:bottom w:val="nil"/>
             </w:tcBorders>
-          </w:tcPr>
-          <w:p>
-            <w:pPr>
-              <w:jc w:val="right"/>
-              <w:rPr>
-                <w:sz w:val="16"/>
-                <w:szCs w:val="16"/>
-              </w:rPr>
-            </w:pPr>
-            <w:r>
-              <w:rPr>
-                <w:sz w:val="16"/>
-                <w:szCs w:val="16"/>
-              </w:rPr>
-              <w:t>1.866</w:t>
+            <w:shd w:val="clear" w:color="auto" w:fill="auto"/>
+          </w:tcPr>
+          <w:p>
+            <w:pPr>
+              <w:jc w:val="right"/>
+              <w:rPr>
+                <w:b/>
+                <w:sz w:val="16"/>
+                <w:szCs w:val="16"/>
+              </w:rPr>
+            </w:pPr>
+            <w:r>
+              <w:rPr>
+                <w:b/>
+                <w:sz w:val="16"/>
+                <w:szCs w:val="16"/>
+              </w:rPr>
+              <w:t>1.8</w:t>
+            </w:r>
+            <w:r>
+              <w:rPr>
+                <w:b/>
+                <w:sz w:val="16"/>
+                <w:szCs w:val="16"/>
+              </w:rPr>
+              <w:t>9</w:t>
+            </w:r>
+            <w:r>
+              <w:rPr>
+                <w:b/>
+                <w:sz w:val="16"/>
+                <w:szCs w:val="16"/>
+              </w:rPr>
+              <w:t>6</w:t>
             </w:r>
           </w:p>
         </w:tc>
@@ -22294,6 +22676,7 @@
               <w:top w:val="nil"/>
               <w:bottom w:val="nil"/>
             </w:tcBorders>
+            <w:shd w:val="clear" w:color="auto" w:fill="auto"/>
           </w:tcPr>
           <w:p>
             <w:pPr>
@@ -22330,21 +22713,22 @@
               <w:top w:val="nil"/>
               <w:bottom w:val="nil"/>
             </w:tcBorders>
-          </w:tcPr>
-          <w:p>
-            <w:pPr>
-              <w:jc w:val="right"/>
-              <w:rPr>
-                <w:sz w:val="16"/>
-                <w:szCs w:val="16"/>
-              </w:rPr>
-            </w:pPr>
-            <w:r>
-              <w:rPr>
-                <w:sz w:val="16"/>
-                <w:szCs w:val="16"/>
-              </w:rPr>
-              <w:t>-6.495</w:t>
+            <w:shd w:val="clear" w:color="auto" w:fill="auto"/>
+          </w:tcPr>
+          <w:p>
+            <w:pPr>
+              <w:jc w:val="right"/>
+              <w:rPr>
+                <w:sz w:val="16"/>
+                <w:szCs w:val="16"/>
+              </w:rPr>
+            </w:pPr>
+            <w:r>
+              <w:rPr>
+                <w:sz w:val="16"/>
+                <w:szCs w:val="16"/>
+              </w:rPr>
+              <w:t>-6.481</w:t>
             </w:r>
           </w:p>
         </w:tc>
@@ -22355,6 +22739,7 @@
               <w:top w:val="nil"/>
               <w:bottom w:val="nil"/>
             </w:tcBorders>
+            <w:shd w:val="clear" w:color="auto" w:fill="auto"/>
           </w:tcPr>
           <w:p>
             <w:pPr>
@@ -22393,21 +22778,22 @@
               <w:top w:val="nil"/>
               <w:bottom w:val="nil"/>
             </w:tcBorders>
-          </w:tcPr>
-          <w:p>
-            <w:pPr>
-              <w:jc w:val="right"/>
-              <w:rPr>
-                <w:sz w:val="16"/>
-                <w:szCs w:val="16"/>
-              </w:rPr>
-            </w:pPr>
-            <w:r>
-              <w:rPr>
-                <w:sz w:val="16"/>
-                <w:szCs w:val="16"/>
-              </w:rPr>
-              <w:t>-1.588</w:t>
+            <w:shd w:val="clear" w:color="auto" w:fill="auto"/>
+          </w:tcPr>
+          <w:p>
+            <w:pPr>
+              <w:jc w:val="right"/>
+              <w:rPr>
+                <w:sz w:val="16"/>
+                <w:szCs w:val="16"/>
+              </w:rPr>
+            </w:pPr>
+            <w:r>
+              <w:rPr>
+                <w:sz w:val="16"/>
+                <w:szCs w:val="16"/>
+              </w:rPr>
+              <w:t>-1.622</w:t>
             </w:r>
           </w:p>
         </w:tc>
@@ -22418,23 +22804,40 @@
               <w:top w:val="nil"/>
               <w:bottom w:val="nil"/>
             </w:tcBorders>
-          </w:tcPr>
-          <w:p>
-            <w:pPr>
-              <w:jc w:val="right"/>
-              <w:rPr>
-                <w:rFonts w:cstheme="minorHAnsi"/>
-                <w:sz w:val="16"/>
-                <w:szCs w:val="16"/>
-              </w:rPr>
-            </w:pPr>
-            <w:r>
-              <w:rPr>
-                <w:rFonts w:cstheme="minorHAnsi"/>
-                <w:sz w:val="16"/>
-                <w:szCs w:val="16"/>
-              </w:rPr>
-              <w:t>46.1%</w:t>
+            <w:shd w:val="clear" w:color="auto" w:fill="auto"/>
+          </w:tcPr>
+          <w:p>
+            <w:pPr>
+              <w:jc w:val="right"/>
+              <w:rPr>
+                <w:rFonts w:cstheme="minorHAnsi"/>
+                <w:sz w:val="16"/>
+                <w:szCs w:val="16"/>
+              </w:rPr>
+            </w:pPr>
+            <w:r>
+              <w:rPr>
+                <w:rFonts w:cstheme="minorHAnsi"/>
+                <w:sz w:val="16"/>
+                <w:szCs w:val="16"/>
+              </w:rPr>
+              <w:t>46.</w:t>
+            </w:r>
+            <w:r>
+              <w:rPr>
+                <w:rFonts w:cstheme="minorHAnsi"/>
+                <w:sz w:val="16"/>
+                <w:szCs w:val="16"/>
+              </w:rPr>
+              <w:t>0</w:t>
+            </w:r>
+            <w:r>
+              <w:rPr>
+                <w:rFonts w:cstheme="minorHAnsi"/>
+                <w:sz w:val="16"/>
+                <w:szCs w:val="16"/>
+              </w:rPr>
+              <w:t>%</w:t>
             </w:r>
           </w:p>
         </w:tc>
@@ -22463,6 +22866,7 @@
             <w:tcBorders>
               <w:top w:val="nil"/>
             </w:tcBorders>
+            <w:shd w:val="clear" w:color="auto" w:fill="auto"/>
           </w:tcPr>
           <w:p>
             <w:pPr>
@@ -22483,6 +22887,7 @@
             <w:tcBorders>
               <w:top w:val="nil"/>
             </w:tcBorders>
+            <w:shd w:val="clear" w:color="auto" w:fill="auto"/>
           </w:tcPr>
           <w:p>
             <w:pPr>
@@ -22500,6 +22905,7 @@
             <w:tcBorders>
               <w:top w:val="nil"/>
             </w:tcBorders>
+            <w:shd w:val="clear" w:color="auto" w:fill="auto"/>
           </w:tcPr>
           <w:p>
             <w:pPr>
@@ -22535,21 +22941,22 @@
             <w:tcBorders>
               <w:top w:val="nil"/>
             </w:tcBorders>
-          </w:tcPr>
-          <w:p>
-            <w:pPr>
-              <w:jc w:val="right"/>
-              <w:rPr>
-                <w:sz w:val="16"/>
-                <w:szCs w:val="16"/>
-              </w:rPr>
-            </w:pPr>
-            <w:r>
-              <w:rPr>
-                <w:sz w:val="16"/>
-                <w:szCs w:val="16"/>
-              </w:rPr>
-              <w:t>-6.482</w:t>
+            <w:shd w:val="clear" w:color="auto" w:fill="auto"/>
+          </w:tcPr>
+          <w:p>
+            <w:pPr>
+              <w:jc w:val="right"/>
+              <w:rPr>
+                <w:sz w:val="16"/>
+                <w:szCs w:val="16"/>
+              </w:rPr>
+            </w:pPr>
+            <w:r>
+              <w:rPr>
+                <w:sz w:val="16"/>
+                <w:szCs w:val="16"/>
+              </w:rPr>
+              <w:t>-6.468</w:t>
             </w:r>
           </w:p>
         </w:tc>
@@ -22559,6 +22966,7 @@
             <w:tcBorders>
               <w:top w:val="nil"/>
             </w:tcBorders>
+            <w:shd w:val="clear" w:color="auto" w:fill="auto"/>
           </w:tcPr>
           <w:p>
             <w:pPr>
@@ -22596,23 +23004,22 @@
             <w:tcBorders>
               <w:top w:val="nil"/>
             </w:tcBorders>
-            <w:vAlign w:val="bottom"/>
-          </w:tcPr>
-          <w:p>
-            <w:pPr>
-              <w:jc w:val="right"/>
-              <w:rPr>
-                <w:rFonts w:cstheme="minorHAnsi"/>
-                <w:sz w:val="16"/>
-                <w:szCs w:val="16"/>
-              </w:rPr>
-            </w:pPr>
-            <w:r>
-              <w:rPr>
-                <w:sz w:val="16"/>
-                <w:szCs w:val="16"/>
-              </w:rPr>
-              <w:t>-1.574</w:t>
+            <w:shd w:val="clear" w:color="auto" w:fill="auto"/>
+          </w:tcPr>
+          <w:p>
+            <w:pPr>
+              <w:jc w:val="right"/>
+              <w:rPr>
+                <w:sz w:val="16"/>
+                <w:szCs w:val="16"/>
+              </w:rPr>
+            </w:pPr>
+            <w:r>
+              <w:rPr>
+                <w:sz w:val="16"/>
+                <w:szCs w:val="16"/>
+              </w:rPr>
+              <w:t>-1.635</w:t>
             </w:r>
           </w:p>
         </w:tc>
@@ -22622,24 +23029,33 @@
             <w:tcBorders>
               <w:top w:val="nil"/>
             </w:tcBorders>
-            <w:vAlign w:val="bottom"/>
-          </w:tcPr>
-          <w:p>
-            <w:pPr>
-              <w:jc w:val="right"/>
-              <w:rPr>
-                <w:rFonts w:cstheme="minorHAnsi"/>
-                <w:sz w:val="16"/>
-                <w:szCs w:val="16"/>
-              </w:rPr>
-            </w:pPr>
-            <w:r>
-              <w:rPr>
-                <w:rFonts w:cstheme="minorHAnsi"/>
-                <w:sz w:val="16"/>
-                <w:szCs w:val="16"/>
-              </w:rPr>
-              <w:t>46.1%</w:t>
+            <w:shd w:val="clear" w:color="auto" w:fill="auto"/>
+            <w:vAlign w:val="bottom"/>
+          </w:tcPr>
+          <w:p>
+            <w:pPr>
+              <w:jc w:val="right"/>
+              <w:rPr>
+                <w:rFonts w:cstheme="minorHAnsi"/>
+                <w:sz w:val="16"/>
+                <w:szCs w:val="16"/>
+              </w:rPr>
+            </w:pPr>
+            <w:r>
+              <w:rPr>
+                <w:rFonts w:cstheme="minorHAnsi"/>
+                <w:sz w:val="16"/>
+                <w:szCs w:val="16"/>
+              </w:rPr>
+              <w:t>46.0</w:t>
+            </w:r>
+            <w:r>
+              <w:rPr>
+                <w:rFonts w:cstheme="minorHAnsi"/>
+                <w:sz w:val="16"/>
+                <w:szCs w:val="16"/>
+              </w:rPr>
+              <w:t>%</w:t>
             </w:r>
           </w:p>
         </w:tc>
@@ -22658,7 +23074,7 @@
           <v:shape id="_x0000_i1027" type="#_x0000_t75" style="width:280.5pt;height:217pt" o:ole="" o:allowoverlap="f">
             <v:imagedata r:id="rId9" o:title="" croptop="3903f" cropbottom="2342f" cropleft="5516f" cropright="5516f"/>
           </v:shape>
-          <o:OLEObject Type="Embed" ProgID="Origin50.Graph" ShapeID="_x0000_i1027" DrawAspect="Content" ObjectID="_1838819436" r:id="rId10"/>
+          <o:OLEObject Type="Embed" ProgID="Origin50.Graph" ShapeID="_x0000_i1027" DrawAspect="Content" ObjectID="_1839596708" r:id="rId10"/>
         </w:object>
       </w:r>
     </w:p>
@@ -22688,7 +23104,7 @@
           <v:shape id="_x0000_i1028" type="#_x0000_t75" style="width:274pt;height:198pt" o:ole="" o:allowoverlap="f">
             <v:imagedata r:id="rId11" o:title="" croptop="4100f" cropbottom="4100f" cropleft="5712f" cropright="5712f"/>
           </v:shape>
-          <o:OLEObject Type="Embed" ProgID="Origin50.Graph" ShapeID="_x0000_i1028" DrawAspect="Content" ObjectID="_1838819437" r:id="rId12"/>
+          <o:OLEObject Type="Embed" ProgID="Origin50.Graph" ShapeID="_x0000_i1028" DrawAspect="Content" ObjectID="_1839596709" r:id="rId12"/>
         </w:object>
       </w:r>
     </w:p>

</xml_diff>